<commit_message>
feat: Add initial drafts for the research paper, including detailed sections, and a vulnerability report.
</commit_message>
<xml_diff>
--- a/research/Bachelor_Paper_Draft.docx
+++ b/research/Bachelor_Paper_Draft.docx
@@ -69,7 +69,7 @@
         <w:pStyle w:val="BodyText"/>
       </w:pPr>
       <w:r>
-        <w:t xml:space="preserve">In this project, we present an autonomous web vulnerability scanner driven by a Deep Q-Network (DQN) architecture. Our system uses a custom environment, WebSecurityGym, which translates complex website interactions into simple numeric states and actions that the AI can understand. The intelligence of the scanner is powered by an advanced version of DQN called a Double Dueling Deep Q-Network. To help the agent learn faster, we also introduce a Phase-Based Learning strategy, which restricts the agent to basic scanning before allowing it to try complex exploits. Through evaluating our system on several vulnerable websites, we demonstrate that RL is a promising technology for the future of automated security testing.</w:t>
+        <w:t xml:space="preserve">In this project, we present an autonomous web vulnerability scanner driven by a Deep Q-Network (DQN) architecture. Our system uses a custom environment, WebSecurityGym, which translates complex website interactions into simple numeric states and actions that the AI can understand. The intelligence of the scanner is powered by a state-of-the-art version of DQN called a Rainbow Deep Q-Network (Rainbow DQN). To help the agent learn faster, we also introduce a Phase-Based Learning strategy, which restricts the agent to basic scanning before allowing it to try complex exploits. Through evaluating our system on several vulnerable websites, we demonstrate that RL is a promising technology for the future of automated security testing.</w:t>
       </w:r>
     </w:p>
     <w:p>
@@ -414,7 +414,7 @@
         <w:pStyle w:val="FirstParagraph"/>
       </w:pPr>
       <w:r>
-        <w:t xml:space="preserve">The core intelligence runs on a</w:t>
+        <w:t xml:space="preserve">The core intelligence runs on an advanced</w:t>
       </w:r>
       <w:r>
         <w:t xml:space="preserve"> </w:t>
@@ -425,6 +425,22 @@
           <w:bCs/>
         </w:rPr>
         <w:t xml:space="preserve">Deep Q-Network (DQN)</w:t>
+      </w:r>
+      <w:r>
+        <w:t xml:space="preserve"> </w:t>
+      </w:r>
+      <w:r>
+        <w:t xml:space="preserve">known as</w:t>
+      </w:r>
+      <w:r>
+        <w:t xml:space="preserve"> </w:t>
+      </w:r>
+      <w:r>
+        <w:rPr>
+          <w:b/>
+          <w:bCs/>
+        </w:rPr>
+        <w:t xml:space="preserve">Rainbow DQN</w:t>
       </w:r>
       <w:r>
         <w:t xml:space="preserve">. Standard Q-Learning tries to learn the maximum expected future reward for taking a specific action in a specific state. This is updated using the Bellman equation, which we can simplify as:</w:t>
@@ -574,20 +590,7 @@
         <w:pStyle w:val="FirstParagraph"/>
       </w:pPr>
       <w:r>
-        <w:t xml:space="preserve">To improve stability, we specifically use a</w:t>
-      </w:r>
-      <w:r>
-        <w:t xml:space="preserve"> </w:t>
-      </w:r>
-      <w:r>
-        <w:rPr>
-          <w:b/>
-          <w:bCs/>
-        </w:rPr>
-        <w:t xml:space="preserve">Double Dueling DQN</w:t>
-      </w:r>
-      <w:r>
-        <w:t xml:space="preserve">.</w:t>
+        <w:t xml:space="preserve">To vastly improve stability and learning speed, Rainbow DQN combines multiple major AI improvements together:</w:t>
       </w:r>
     </w:p>
     <w:p>
@@ -632,6 +635,62 @@
       </w:r>
       <w:r>
         <w:t xml:space="preserve">splits the neural network into two streams: one calculates the general value of the current website state, and the other calculates the advantage of taking a specific action. This helps the agent learn faster because it realizes some states are just inherently bad (like being blocked by a firewall), regardless of what action it takes next.</w:t>
+      </w:r>
+    </w:p>
+    <w:p>
+      <w:pPr>
+        <w:pStyle w:val="Compact"/>
+        <w:numPr>
+          <w:ilvl w:val="0"/>
+          <w:numId w:val="1004"/>
+        </w:numPr>
+      </w:pPr>
+      <w:r>
+        <w:rPr>
+          <w:b/>
+          <w:bCs/>
+        </w:rPr>
+        <w:t xml:space="preserve">Prioritized Experience Replay (PER)</w:t>
+      </w:r>
+      <w:r>
+        <w:t xml:space="preserve"> </w:t>
+      </w:r>
+      <w:r>
+        <w:t xml:space="preserve">ensures the agent learns from its most</w:t>
+      </w:r>
+      <w:r>
+        <w:t xml:space="preserve"> </w:t>
+      </w:r>
+      <w:r>
+        <w:t xml:space="preserve">“surprising”</w:t>
+      </w:r>
+      <w:r>
+        <w:t xml:space="preserve"> </w:t>
+      </w:r>
+      <w:r>
+        <w:t xml:space="preserve">mistakes or newly discovered vulnerabilities much more frequently than random, boring actions (like receiving a standard 404 page).</w:t>
+      </w:r>
+    </w:p>
+    <w:p>
+      <w:pPr>
+        <w:pStyle w:val="Compact"/>
+        <w:numPr>
+          <w:ilvl w:val="0"/>
+          <w:numId w:val="1004"/>
+        </w:numPr>
+      </w:pPr>
+      <w:r>
+        <w:rPr>
+          <w:b/>
+          <w:bCs/>
+        </w:rPr>
+        <w:t xml:space="preserve">Noisy Networks</w:t>
+      </w:r>
+      <w:r>
+        <w:t xml:space="preserve"> </w:t>
+      </w:r>
+      <w:r>
+        <w:t xml:space="preserve">adds deliberate mathematical noise directly into the neural network instead of just guessing random actions. This forces the agent to explore the website much more systematically.</w:t>
       </w:r>
     </w:p>
     <w:bookmarkStart w:id="15" w:name="reward-function"/>
@@ -2821,7 +2880,7 @@
         <w:pStyle w:val="FirstParagraph"/>
       </w:pPr>
       <w:r>
-        <w:t xml:space="preserve">In this paper, we introduced an autonomous web vulnerability scanner driven by a Double Dueling Deep Q-Network (D3QN) agent. By treating web exploitation as a formalized game environment, we’ve shown that Reinforcement Learning can successfully replicate the cognitive adaptability of a human penetration tester at scale. Thanks to our Phase-Based Learning implementation, the agent seamlessly learned to navigate the Cyber Kill Chain—moving from reconnaissance to the execution of deep exploit chains like XSS and SQLi.</w:t>
+        <w:t xml:space="preserve">In this paper, we introduced an autonomous web vulnerability scanner driven by a Rainbow Deep Q-Network (Rainbow DQN) agent. By treating web exploitation as a formalized game environment, we’ve shown that Reinforcement Learning can successfully replicate the cognitive adaptability of a human penetration tester at scale. Thanks to our Phase-Based Learning implementation, the agent seamlessly learned to navigate the Cyber Kill Chain—moving from reconnaissance to the execution of deep exploit chains like XSS and SQLi.</w:t>
       </w:r>
     </w:p>
     <w:p>

</xml_diff>

<commit_message>
docs: Add research paper drafts and a D3QN vulnerability finder diagram.
</commit_message>
<xml_diff>
--- a/research/Bachelor_Paper_Draft.docx
+++ b/research/Bachelor_Paper_Draft.docx
@@ -69,7 +69,7 @@
         <w:pStyle w:val="BodyText"/>
       </w:pPr>
       <w:r>
-        <w:t xml:space="preserve">In this project, we present an autonomous web vulnerability scanner driven by a Deep Q-Network (DQN) architecture. Our system uses a custom environment, WebSecurityGym, which translates complex website interactions into simple numeric states and actions that the AI can understand. The intelligence of the scanner is powered by a state-of-the-art version of DQN called a Rainbow Deep Q-Network (Rainbow DQN). To help the agent learn faster, we also introduce a Phase-Based Learning strategy, which restricts the agent to basic scanning before allowing it to try complex exploits. Through evaluating our system on several vulnerable websites, we demonstrate that RL is a promising technology for the future of automated security testing.</w:t>
+        <w:t xml:space="preserve">In this project, we present an autonomous web vulnerability scanner driven by a Deep Q-Network (DQN) architecture. Our system uses a custom environment, WebSecurityGym, which translates complex website interactions into simple numeric states and actions that the AI can understand. The intelligence of the scanner is powered by a highly advanced variant of DQN called an Extended Double Dueling Deep Q-Network (Extended D3QN), which incorporates many components from the state-of-the-art Rainbow DQN algorithm. To help the agent learn faster, we also introduce a Phase-Based Learning strategy, which restricts the agent to basic scanning before allowing it to try complex exploits. Through evaluating our system on several vulnerable websites, we demonstrate that RL is a promising technology for the future of automated security testing.</w:t>
       </w:r>
     </w:p>
     <w:p>
@@ -430,7 +430,7 @@
         <w:t xml:space="preserve"> </w:t>
       </w:r>
       <w:r>
-        <w:t xml:space="preserve">known as</w:t>
+        <w:t xml:space="preserve">configured as an</w:t>
       </w:r>
       <w:r>
         <w:t xml:space="preserve"> </w:t>
@@ -440,10 +440,13 @@
           <w:b/>
           <w:bCs/>
         </w:rPr>
-        <w:t xml:space="preserve">Rainbow DQN</w:t>
-      </w:r>
-      <w:r>
-        <w:t xml:space="preserve">. Standard Q-Learning tries to learn the maximum expected future reward for taking a specific action in a specific state. This is updated using the Bellman equation, which we can simplify as:</w:t>
+        <w:t xml:space="preserve">Extended D3QN</w:t>
+      </w:r>
+      <w:r>
+        <w:t xml:space="preserve"> </w:t>
+      </w:r>
+      <w:r>
+        <w:t xml:space="preserve">(a partial implementation of the Rainbow DQN algorithm). Standard Q-Learning tries to learn the maximum expected future reward for taking a specific action in a specific state. This is updated using the Bellman equation, which we can simplify as:</w:t>
       </w:r>
     </w:p>
     <w:p>
@@ -590,7 +593,7 @@
         <w:pStyle w:val="FirstParagraph"/>
       </w:pPr>
       <w:r>
-        <w:t xml:space="preserve">To vastly improve stability and learning speed, Rainbow DQN combines multiple major AI improvements together:</w:t>
+        <w:t xml:space="preserve">To vastly improve stability and learning speed, our Extended D3QN combines five major AI improvements together:</w:t>
       </w:r>
     </w:p>
     <w:p>
@@ -691,6 +694,28 @@
       </w:r>
       <w:r>
         <w:t xml:space="preserve">adds deliberate mathematical noise directly into the neural network instead of just guessing random actions. This forces the agent to explore the website much more systematically.</w:t>
+      </w:r>
+    </w:p>
+    <w:p>
+      <w:pPr>
+        <w:pStyle w:val="Compact"/>
+        <w:numPr>
+          <w:ilvl w:val="0"/>
+          <w:numId w:val="1004"/>
+        </w:numPr>
+      </w:pPr>
+      <w:r>
+        <w:rPr>
+          <w:b/>
+          <w:bCs/>
+        </w:rPr>
+        <w:t xml:space="preserve">Multi-Step Learning</w:t>
+      </w:r>
+      <w:r>
+        <w:t xml:space="preserve"> </w:t>
+      </w:r>
+      <w:r>
+        <w:t xml:space="preserve">calculates rewards over several future steps (rather than just the single next step), allowing the agent to figure out which initial vulnerability (like a minor configuration flaw) led to a massive payoff (like a full database breach) much later in the attack chain.</w:t>
       </w:r>
     </w:p>
     <w:bookmarkStart w:id="15" w:name="reward-function"/>
@@ -2880,7 +2905,7 @@
         <w:pStyle w:val="FirstParagraph"/>
       </w:pPr>
       <w:r>
-        <w:t xml:space="preserve">In this paper, we introduced an autonomous web vulnerability scanner driven by a Rainbow Deep Q-Network (Rainbow DQN) agent. By treating web exploitation as a formalized game environment, we’ve shown that Reinforcement Learning can successfully replicate the cognitive adaptability of a human penetration tester at scale. Thanks to our Phase-Based Learning implementation, the agent seamlessly learned to navigate the Cyber Kill Chain—moving from reconnaissance to the execution of deep exploit chains like XSS and SQLi.</w:t>
+        <w:t xml:space="preserve">In this paper, we introduced an autonomous web vulnerability scanner driven by an Extended Double Dueling Deep Q-Network (Extended D3QN) agent. By treating web exploitation as a formalized game environment, we’ve shown that Reinforcement Learning can successfully replicate the cognitive adaptability of a human penetration tester at scale. Thanks to our Phase-Based Learning implementation, the agent seamlessly learned to navigate the Cyber Kill Chain—moving from reconnaissance to the execution of deep exploit chains like XSS and SQLi.</w:t>
       </w:r>
     </w:p>
     <w:p>

</xml_diff>

<commit_message>
feat: Establish initial research foundation for an autonomous web vulnerability testing project, including paper drafts, related work PDFs, and utility scripts for PDF content extraction.
</commit_message>
<xml_diff>
--- a/research/Bachelor_Paper_Draft.docx
+++ b/research/Bachelor_Paper_Draft.docx
@@ -80,12 +80,199 @@
       </w:r>
     </w:p>
     <w:bookmarkEnd w:id="10"/>
-    <w:bookmarkStart w:id="18" w:name="iii.-methodology"/>
+    <w:bookmarkStart w:id="14" w:name="ii.-related-work"/>
     <w:p>
       <w:pPr>
         <w:pStyle w:val="Heading1"/>
       </w:pPr>
       <w:r>
+        <w:t xml:space="preserve">II. RELATED WORK</w:t>
+      </w:r>
+    </w:p>
+    <w:p>
+      <w:pPr>
+        <w:pStyle w:val="FirstParagraph"/>
+      </w:pPr>
+      <w:r>
+        <w:t xml:space="preserve">The intersection of artificial intelligence and cybersecurity has seen significant growth over the years. This section reviews the existing research surrounding web application security testing, the transition from manual to automated methods, and the growing role of Deep Reinforcement Learning (DRL) in penetration testing.</w:t>
+      </w:r>
+    </w:p>
+    <w:bookmarkStart w:id="11" w:name="X8b4137e7aaa471a7bd5c8bfd868e73d8aa6c7b2"/>
+    <w:p>
+      <w:pPr>
+        <w:pStyle w:val="Heading2"/>
+      </w:pPr>
+      <w:r>
+        <w:t xml:space="preserve">A. Traditional Web Application Security Testing</w:t>
+      </w:r>
+    </w:p>
+    <w:p>
+      <w:pPr>
+        <w:pStyle w:val="FirstParagraph"/>
+      </w:pPr>
+      <w:r>
+        <w:t xml:space="preserve">Securing web applications has traditionally relied on well-established testing methods. Dynamic Application Security Testing (DAST) represents a real-time approach to finding vulnerabilities by actively probing live applications through simulated attacks [1]. Unlike scanning the raw code, DAST observes how the application behaves while running, making it effective for discovering deployment flaws, server configuration errors, and runtime injection vulnerabilities [1]. Interestingly, studies directly comparing scripts versus manual penetration testing conclude that while scripts are much faster at basic checks, they inherently fail to spot logical flaws that a human tester would easily notice [12].</w:t>
+      </w:r>
+    </w:p>
+    <w:p>
+      <w:pPr>
+        <w:pStyle w:val="BodyText"/>
+      </w:pPr>
+      <w:r>
+        <w:t xml:space="preserve">Furthermore, ethical hacking relies extremely heavily on automated scanning tools. Security researchers have even studied the forensic</w:t>
+      </w:r>
+      <w:r>
+        <w:t xml:space="preserve"> </w:t>
+      </w:r>
+      <w:r>
+        <w:t xml:space="preserve">“tool marks”</w:t>
+      </w:r>
+      <w:r>
+        <w:t xml:space="preserve"> </w:t>
+      </w:r>
+      <w:r>
+        <w:t xml:space="preserve">left behind on networks to identify exactly which hacking toolkits are being aimed at applications [13]. For example, studies comparing popular vulnerability scanners, such as OWASP ZAP and Nikto, prove their ability to find basic, common weaknesses rapidly [2]. While these tools provide structured vulnerability analysis, they rigidly follow predefined rules and signatures. Consequently, they often get stuck when faced with complex, multi-step exploits or brand-new attack methods (zero-days) that require a deeper understanding of the website [2]. To address specific domains like Service-Oriented Architectures (SOA), specialized pentesting tools such as WS-Attacker have been built to automate attacks on complex Web Services [3]. However, as web services grow ever more complicated, there is a clear and growing need for</w:t>
+      </w:r>
+      <w:r>
+        <w:t xml:space="preserve"> </w:t>
+      </w:r>
+      <w:r>
+        <w:t xml:space="preserve">“smart”</w:t>
+      </w:r>
+      <w:r>
+        <w:t xml:space="preserve"> </w:t>
+      </w:r>
+      <w:r>
+        <w:t xml:space="preserve">scanners that can actually learn and adapt their strategies dynamically.</w:t>
+      </w:r>
+    </w:p>
+    <w:bookmarkEnd w:id="11"/>
+    <w:bookmarkStart w:id="12" w:name="X90adb92d7234c0b08f384b330e1160940423868"/>
+    <w:p>
+      <w:pPr>
+        <w:pStyle w:val="Heading2"/>
+      </w:pPr>
+      <w:r>
+        <w:t xml:space="preserve">B. Reinforcement Learning in Cybersecurity</w:t>
+      </w:r>
+    </w:p>
+    <w:p>
+      <w:pPr>
+        <w:pStyle w:val="FirstParagraph"/>
+      </w:pPr>
+      <w:r>
+        <w:t xml:space="preserve">The limitations of basic rule-based scanners have pushed researchers to explore intelligent, learning-based agents. Deep Reinforcement Learning (DRL) is excellent for handling complicated, dynamic cyber protection problems [4]. In the context of detecting network intrusions, researchers have proposed models based on Deep Q-Learning (DQL) that use an automated trial-and-error method, allowing the system to continually get better on its own [4].</w:t>
+      </w:r>
+    </w:p>
+    <w:p>
+      <w:pPr>
+        <w:pStyle w:val="BodyText"/>
+      </w:pPr>
+      <w:r>
+        <w:t xml:space="preserve">The foundation for these advanced DRL applications comes from major breakthroughs in AI. Mnih et al. demonstrated that a deep Q-network (DQN) could achieve human-level performance across many different tasks using only raw inputs and rewards, establishing a new gold standard for autonomous decision-making [5].</w:t>
+      </w:r>
+    </w:p>
+    <w:bookmarkEnd w:id="12"/>
+    <w:bookmarkStart w:id="13" w:name="X6a07811c902d2d0ac4c54d1af50f8aa41afe363"/>
+    <w:p>
+      <w:pPr>
+        <w:pStyle w:val="Heading2"/>
+      </w:pPr>
+      <w:r>
+        <w:t xml:space="preserve">C. Advanced DRL Architectures for Penetration Testing</w:t>
+      </w:r>
+    </w:p>
+    <w:p>
+      <w:pPr>
+        <w:pStyle w:val="FirstParagraph"/>
+      </w:pPr>
+      <w:r>
+        <w:t xml:space="preserve">Building upon the success of the standard DQN, more sophisticated AI architectures have been invented to improve how fast an agent learns. A notable advancement is Prioritized Experience Replay (PER) by Schaul et al., which forces the agent to review its most important or</w:t>
+      </w:r>
+      <w:r>
+        <w:t xml:space="preserve"> </w:t>
+      </w:r>
+      <w:r>
+        <w:t xml:space="preserve">“surprising”</w:t>
+      </w:r>
+      <w:r>
+        <w:t xml:space="preserve"> </w:t>
+      </w:r>
+      <w:r>
+        <w:t xml:space="preserve">experiences more often than normal, boring events so that it learns faster [6].</w:t>
+      </w:r>
+    </w:p>
+    <w:p>
+      <w:pPr>
+        <w:pStyle w:val="BodyText"/>
+      </w:pPr>
+      <w:r>
+        <w:t xml:space="preserve">In automated penetration testing, researchers are using these advanced techniques to train intelligent agents capable of discovering vulnerabilities. Recent studies, such as the Intelligent Automated Penetration Testing Framework (IAPTF) by Ghanem et al., have successfully used reinforcement learning to automate step-by-step decision-making in security assessments. By modeling hacking as a Partially Observable Markov Decision Process (POMDP), IAPTF showed it could discover multi-step vulnerabilities in complex networks while integrating with established toolkits like Metasploit [7]. Similarly, systems like ASAP combine Deep Q-Networks with Attack Graphs to automatically generate non-intuitive pathways to penetrate large enterprise networks [14]. Other modern tools are pushing these boundaries further;</w:t>
+      </w:r>
+      <w:r>
+        <w:t xml:space="preserve"> </w:t>
+      </w:r>
+      <w:r>
+        <w:t xml:space="preserve">“Pentest-R1”</w:t>
+      </w:r>
+      <w:r>
+        <w:t xml:space="preserve"> </w:t>
+      </w:r>
+      <w:r>
+        <w:t xml:space="preserve">pairs AI reasoning (like ChatGPT) with RL to navigate complex capture-the-flag environments [8], while frameworks like</w:t>
+      </w:r>
+      <w:r>
+        <w:t xml:space="preserve"> </w:t>
+      </w:r>
+      <w:r>
+        <w:t xml:space="preserve">“Re-Pen”</w:t>
+      </w:r>
+      <w:r>
+        <w:t xml:space="preserve"> </w:t>
+      </w:r>
+      <w:r>
+        <w:t xml:space="preserve">apply these identical RL mechanics to find physical hardware flaws in microchips [9]. To prevent automated agents from</w:t>
+      </w:r>
+      <w:r>
+        <w:t xml:space="preserve"> </w:t>
+      </w:r>
+      <w:r>
+        <w:t xml:space="preserve">“forgetting”</w:t>
+      </w:r>
+      <w:r>
+        <w:t xml:space="preserve"> </w:t>
+      </w:r>
+      <w:r>
+        <w:t xml:space="preserve">past environments, tools like SCRIPT use continual RL for dynamic networks [10]. Moreover, recent systematic reviews confirm that applying RL to penetration testing is becoming essential to handle modern cyber threats [11]. These</w:t>
+      </w:r>
+      <w:r>
+        <w:t xml:space="preserve"> </w:t>
+      </w:r>
+      <w:r>
+        <w:t xml:space="preserve">“Red Team”</w:t>
+      </w:r>
+      <w:r>
+        <w:t xml:space="preserve"> </w:t>
+      </w:r>
+      <w:r>
+        <w:t xml:space="preserve">algorithms map the hacking process to a mathematical game, where the agent learns the best sequence of attacks to navigate environments and exploit vulnerabilities. While existing research has proven DRL works well for network-level intrusion detection and specific web service attacks, comprehensive scanners that address the full spectrum of modern web vulnerabilities utilizing an Extended Double Dueling Deep Q-Network (Extended D3QN) remain a largely unexplored area. Our work bridges this gap by implementing an Extended D3QN agent with PER and Noisy Networks specifically designed for autonomous web vulnerability scanning.</w:t>
+      </w:r>
+    </w:p>
+    <w:p>
+      <w:r>
+        <w:pict>
+          <v:rect style="width:0;height:1.5pt" o:hralign="center" o:hrstd="t" o:hr="t"/>
+        </w:pict>
+      </w:r>
+    </w:p>
+    <w:bookmarkEnd w:id="13"/>
+    <w:bookmarkEnd w:id="14"/>
+    <w:bookmarkStart w:id="22" w:name="iii.-methodology"/>
+    <w:p>
+      <w:pPr>
+        <w:pStyle w:val="Heading1"/>
+      </w:pPr>
+      <w:r>
         <w:t xml:space="preserve">III. METHODOLOGY</w:t>
       </w:r>
     </w:p>
@@ -97,7 +284,7 @@
         <w:t xml:space="preserve">Our system is designed to separate the Artificial Intelligence logic from the actual web requests. The core components include the system architecture, how we formulated the problem for the AI, the design of the RL agent, and the training algorithm.</w:t>
       </w:r>
     </w:p>
-    <w:bookmarkStart w:id="11" w:name="a.-system-architecture"/>
+    <w:bookmarkStart w:id="15" w:name="a.-system-architecture"/>
     <w:p>
       <w:pPr>
         <w:pStyle w:val="Heading2"/>
@@ -183,8 +370,8 @@
         <w:t xml:space="preserve">: For safe training, we built several deliberately vulnerable web applications (such as an E-commerce store and a Banking portal) that respond realistically to the agent’s attacks.</w:t>
       </w:r>
     </w:p>
-    <w:bookmarkEnd w:id="11"/>
-    <w:bookmarkStart w:id="14" w:name="b.-formulating-the-problem-for-ai"/>
+    <w:bookmarkEnd w:id="15"/>
+    <w:bookmarkStart w:id="18" w:name="b.-formulating-the-problem-for-ai"/>
     <w:p>
       <w:pPr>
         <w:pStyle w:val="Heading2"/>
@@ -237,7 +424,7 @@
         <w:t xml:space="preserve">it receives (Reward).</w:t>
       </w:r>
     </w:p>
-    <w:bookmarkStart w:id="12" w:name="state-representation"/>
+    <w:bookmarkStart w:id="16" w:name="state-representation"/>
     <w:p>
       <w:pPr>
         <w:pStyle w:val="Heading3"/>
@@ -311,8 +498,8 @@
         <w:t xml:space="preserve">: Whether the website leaked a database error or if a firewall blocked the request.</w:t>
       </w:r>
     </w:p>
-    <w:bookmarkEnd w:id="12"/>
-    <w:bookmarkStart w:id="13" w:name="action-space"/>
+    <w:bookmarkEnd w:id="16"/>
+    <w:bookmarkStart w:id="17" w:name="action-space"/>
     <w:p>
       <w:pPr>
         <w:pStyle w:val="Heading3"/>
@@ -398,9 +585,9 @@
         <w:t xml:space="preserve">: Dropping complex, weaponized payloads aimed at triggering SQL Injection or XSS.</w:t>
       </w:r>
     </w:p>
-    <w:bookmarkEnd w:id="13"/>
-    <w:bookmarkEnd w:id="14"/>
-    <w:bookmarkStart w:id="17" w:name="c.-agent-design"/>
+    <w:bookmarkEnd w:id="17"/>
+    <w:bookmarkEnd w:id="18"/>
+    <w:bookmarkStart w:id="21" w:name="c.-agent-design"/>
     <w:p>
       <w:pPr>
         <w:pStyle w:val="Heading2"/>
@@ -718,7 +905,7 @@
         <w:t xml:space="preserve">calculates rewards over several future steps (rather than just the single next step), allowing the agent to figure out which initial vulnerability (like a minor configuration flaw) led to a massive payoff (like a full database breach) much later in the attack chain.</w:t>
       </w:r>
     </w:p>
-    <w:bookmarkStart w:id="15" w:name="reward-function"/>
+    <w:bookmarkStart w:id="19" w:name="reward-function"/>
     <w:p>
       <w:pPr>
         <w:pStyle w:val="Heading3"/>
@@ -853,8 +1040,8 @@
         <w:t xml:space="preserve">), which forces the agent to learn to act stealthily.</w:t>
       </w:r>
     </w:p>
-    <w:bookmarkEnd w:id="15"/>
-    <w:bookmarkStart w:id="16" w:name="phase-based-training-algorithm"/>
+    <w:bookmarkEnd w:id="19"/>
+    <w:bookmarkStart w:id="20" w:name="phase-based-training-algorithm"/>
     <w:p>
       <w:pPr>
         <w:pStyle w:val="Heading3"/>
@@ -1045,10 +1232,10 @@
         </w:pict>
       </w:r>
     </w:p>
-    <w:bookmarkEnd w:id="16"/>
-    <w:bookmarkEnd w:id="17"/>
-    <w:bookmarkEnd w:id="18"/>
-    <w:bookmarkStart w:id="19" w:name="iv.-evaluation-and-results"/>
+    <w:bookmarkEnd w:id="20"/>
+    <w:bookmarkEnd w:id="21"/>
+    <w:bookmarkEnd w:id="22"/>
+    <w:bookmarkStart w:id="23" w:name="iv.-evaluation-and-results"/>
     <w:p>
       <w:pPr>
         <w:pStyle w:val="Heading1"/>
@@ -2890,8 +3077,8 @@
         </w:pict>
       </w:r>
     </w:p>
-    <w:bookmarkEnd w:id="19"/>
-    <w:bookmarkStart w:id="20" w:name="vi.-conclusion"/>
+    <w:bookmarkEnd w:id="23"/>
+    <w:bookmarkStart w:id="24" w:name="vi.-conclusion"/>
     <w:p>
       <w:pPr>
         <w:pStyle w:val="Heading1"/>
@@ -2924,7 +3111,260 @@
         <w:t xml:space="preserve">Moving forward, our immediate focus will be on dramatically expanding the agent’s action abilities to cover far more sophisticated flaws. Additionally, we believe bridging this RL orchestrator with Large Language Models (LLMs) could drastically improve its contextual understanding of HTTP responses, finally closing the gap between structural pattern recognition and human-like logic comprehension. Ultimately, this research lays down a solid foundation for the next massive leap in intelligent, adaptive, and scalable automated pentesting frameworks.</w:t>
       </w:r>
     </w:p>
-    <w:bookmarkEnd w:id="20"/>
+    <w:p>
+      <w:r>
+        <w:pict>
+          <v:rect style="width:0;height:1.5pt" o:hralign="center" o:hrstd="t" o:hr="t"/>
+        </w:pict>
+      </w:r>
+    </w:p>
+    <w:bookmarkEnd w:id="24"/>
+    <w:bookmarkStart w:id="25" w:name="references"/>
+    <w:p>
+      <w:pPr>
+        <w:pStyle w:val="Heading1"/>
+      </w:pPr>
+      <w:r>
+        <w:t xml:space="preserve">REFERENCES</w:t>
+      </w:r>
+    </w:p>
+    <w:p>
+      <w:pPr>
+        <w:pStyle w:val="FirstParagraph"/>
+      </w:pPr>
+      <w:r>
+        <w:t xml:space="preserve">[1] R. Singh, S. M. Patil, M. K. Gupta, and D. R. Patil,</w:t>
+      </w:r>
+      <w:r>
+        <w:t xml:space="preserve"> </w:t>
+      </w:r>
+      <w:r>
+        <w:t xml:space="preserve">“Analysis of Web Application Vulnerabilities using Dynamic Application Security Testing.”</w:t>
+      </w:r>
+      <w:r>
+        <w:t xml:space="preserve"> </w:t>
+      </w:r>
+      <w:r>
+        <w:t xml:space="preserve">[2] R. Sri Devi and M. Mohan Kumar,</w:t>
+      </w:r>
+      <w:r>
+        <w:t xml:space="preserve"> </w:t>
+      </w:r>
+      <w:r>
+        <w:t xml:space="preserve">“Testing for Security Weakness of Web Applications using Ethical Hacking.”</w:t>
+      </w:r>
+      <w:r>
+        <w:t xml:space="preserve"> </w:t>
+      </w:r>
+      <w:r>
+        <w:t xml:space="preserve">[3] C. Mainka, J. Somorovsky, and J. Schwenk,</w:t>
+      </w:r>
+      <w:r>
+        <w:t xml:space="preserve"> </w:t>
+      </w:r>
+      <w:r>
+        <w:t xml:space="preserve">“Penetration Testing Tool for Web Services Security,”</w:t>
+      </w:r>
+      <w:r>
+        <w:t xml:space="preserve"> </w:t>
+      </w:r>
+      <w:r>
+        <w:t xml:space="preserve">Ruhr University Bochum, Germany.</w:t>
+      </w:r>
+      <w:r>
+        <w:t xml:space="preserve"> </w:t>
+      </w:r>
+      <w:r>
+        <w:t xml:space="preserve">[4] P. Haritha, G. S. Prasad, K. Niharika, V. Charishma, and K. B. Sai,</w:t>
+      </w:r>
+      <w:r>
+        <w:t xml:space="preserve"> </w:t>
+      </w:r>
+      <w:r>
+        <w:t xml:space="preserve">“Network Intrusion Detection using Deep Reinforcement Learning.”</w:t>
+      </w:r>
+      <w:r>
+        <w:t xml:space="preserve"> </w:t>
+      </w:r>
+      <w:r>
+        <w:t xml:space="preserve">[5] V. Mnih et al.,</w:t>
+      </w:r>
+      <w:r>
+        <w:t xml:space="preserve"> </w:t>
+      </w:r>
+      <w:r>
+        <w:t xml:space="preserve">“Human-level control through deep reinforcement learning,”</w:t>
+      </w:r>
+      <w:r>
+        <w:t xml:space="preserve"> </w:t>
+      </w:r>
+      <w:r>
+        <w:t xml:space="preserve">Nature, vol. 518, pp. 529-533, 2015.</w:t>
+      </w:r>
+      <w:r>
+        <w:t xml:space="preserve"> </w:t>
+      </w:r>
+      <w:r>
+        <w:t xml:space="preserve">[6] T. Schaul, J. Quan, I. Antonoglou, and D. Silver,</w:t>
+      </w:r>
+      <w:r>
+        <w:t xml:space="preserve"> </w:t>
+      </w:r>
+      <w:r>
+        <w:t xml:space="preserve">“Prioritized Experience Replay,”</w:t>
+      </w:r>
+      <w:r>
+        <w:t xml:space="preserve"> </w:t>
+      </w:r>
+      <w:r>
+        <w:t xml:space="preserve">Google DeepMind, ICLR 2016.</w:t>
+      </w:r>
+      <w:r>
+        <w:t xml:space="preserve"> </w:t>
+      </w:r>
+      <w:r>
+        <w:t xml:space="preserve">[7] M. C. Ghanem and T. M. Chen,</w:t>
+      </w:r>
+      <w:r>
+        <w:t xml:space="preserve"> </w:t>
+      </w:r>
+      <w:r>
+        <w:t xml:space="preserve">“Reinforcement learning for intelligent automated penetration testing,”</w:t>
+      </w:r>
+      <w:r>
+        <w:t xml:space="preserve"> </w:t>
+      </w:r>
+      <w:r>
+        <w:t xml:space="preserve">2020.</w:t>
+      </w:r>
+      <w:r>
+        <w:t xml:space="preserve"> </w:t>
+      </w:r>
+      <w:r>
+        <w:t xml:space="preserve">[8] Anonymous,</w:t>
+      </w:r>
+      <w:r>
+        <w:t xml:space="preserve"> </w:t>
+      </w:r>
+      <w:r>
+        <w:t xml:space="preserve">“Pentest-R1: Towards Autonomous Penetration Testing Reasoning Optimized via Two-Stage Reinforcement Learning,”</w:t>
+      </w:r>
+      <w:r>
+        <w:t xml:space="preserve"> </w:t>
+      </w:r>
+      <w:r>
+        <w:t xml:space="preserve">arXiv, 2024.</w:t>
+      </w:r>
+      <w:r>
+        <w:t xml:space="preserve"> </w:t>
+      </w:r>
+      <w:r>
+        <w:t xml:space="preserve">[9] H. A. Shaikh et al.,</w:t>
+      </w:r>
+      <w:r>
+        <w:t xml:space="preserve"> </w:t>
+      </w:r>
+      <w:r>
+        <w:t xml:space="preserve">“Reinforcement Learning-Enforced Penetration Testing for SoC Security Verification,”</w:t>
+      </w:r>
+      <w:r>
+        <w:t xml:space="preserve"> </w:t>
+      </w:r>
+      <w:r>
+        <w:t xml:space="preserve">IEEE Transactions on Very Large Scale Integration (VLSI) Systems, 2024.</w:t>
+      </w:r>
+      <w:r>
+        <w:t xml:space="preserve"> </w:t>
+      </w:r>
+      <w:r>
+        <w:t xml:space="preserve">[10] S. Zhou et al.,</w:t>
+      </w:r>
+      <w:r>
+        <w:t xml:space="preserve"> </w:t>
+      </w:r>
+      <w:r>
+        <w:t xml:space="preserve">“SCRIPT: A Scalable Continual Reinforcement Learning Framework for Autonomous Penetration Testing,”</w:t>
+      </w:r>
+      <w:r>
+        <w:t xml:space="preserve"> </w:t>
+      </w:r>
+      <w:r>
+        <w:t xml:space="preserve">Expert Systems With Applications.</w:t>
+      </w:r>
+      <w:r>
+        <w:t xml:space="preserve"> </w:t>
+      </w:r>
+      <w:r>
+        <w:t xml:space="preserve">[11] J. Liu et al.,</w:t>
+      </w:r>
+      <w:r>
+        <w:t xml:space="preserve"> </w:t>
+      </w:r>
+      <w:r>
+        <w:t xml:space="preserve">“Autonomous penetration testing using reinforcement learning: A review and perspectives,”</w:t>
+      </w:r>
+      <w:r>
+        <w:t xml:space="preserve"> </w:t>
+      </w:r>
+      <w:r>
+        <w:t xml:space="preserve">Expert Systems With Applications.</w:t>
+      </w:r>
+      <w:r>
+        <w:t xml:space="preserve"> </w:t>
+      </w:r>
+      <w:r>
+        <w:t xml:space="preserve">[12] N. Singh, V. Meherhomji, and B. R. Chandavarkar,</w:t>
+      </w:r>
+      <w:r>
+        <w:t xml:space="preserve"> </w:t>
+      </w:r>
+      <w:r>
+        <w:t xml:space="preserve">“Automated versus Manual Approach of Web Application Penetration Testing,”</w:t>
+      </w:r>
+      <w:r>
+        <w:t xml:space="preserve"> </w:t>
+      </w:r>
+      <w:r>
+        <w:t xml:space="preserve">National Institute of Technology Karnataka.</w:t>
+      </w:r>
+      <w:r>
+        <w:t xml:space="preserve"> </w:t>
+      </w:r>
+      <w:r>
+        <w:t xml:space="preserve">[13] D. Kao, Y. Chen, and F. Tsai,</w:t>
+      </w:r>
+      <w:r>
+        <w:t xml:space="preserve"> </w:t>
+      </w:r>
+      <w:r>
+        <w:t xml:space="preserve">“Hacking Tool Identification in Penetration Testing,”</w:t>
+      </w:r>
+      <w:r>
+        <w:t xml:space="preserve"> </w:t>
+      </w:r>
+      <w:r>
+        <w:t xml:space="preserve">Central Police University.</w:t>
+      </w:r>
+      <w:r>
+        <w:t xml:space="preserve"> </w:t>
+      </w:r>
+      <w:r>
+        <w:t xml:space="preserve">[14] A. Chowdhary et al.,</w:t>
+      </w:r>
+      <w:r>
+        <w:t xml:space="preserve"> </w:t>
+      </w:r>
+      <w:r>
+        <w:t xml:space="preserve">“Autonomous Security Analysis and Penetration Testing,”</w:t>
+      </w:r>
+      <w:r>
+        <w:t xml:space="preserve"> </w:t>
+      </w:r>
+      <w:r>
+        <w:t xml:space="preserve">Arizona State University.</w:t>
+      </w:r>
+    </w:p>
+    <w:bookmarkEnd w:id="25"/>
     <w:sectPr>
       <w:footnotePr>
         <w:numRestart w:val="eachSect"/>

</xml_diff>

<commit_message>
feat: Add initial research paper drafts and a Python script to generate a D3QN training curve.
</commit_message>
<xml_diff>
--- a/research/Bachelor_Paper_Draft.docx
+++ b/research/Bachelor_Paper_Draft.docx
@@ -2,7 +2,17 @@
 <file path=word/document.xml><?xml version="1.0" encoding="utf-8"?>
 <w:document xmlns:w="http://schemas.openxmlformats.org/wordprocessingml/2006/main" xmlns:m="http://schemas.openxmlformats.org/officeDocument/2006/math" xmlns:r="http://schemas.openxmlformats.org/officeDocument/2006/relationships" xmlns:o="urn:schemas-microsoft-com:office:office" xmlns:v="urn:schemas-microsoft-com:vml" xmlns:w10="urn:schemas-microsoft-com:office:word" xmlns:a="http://schemas.openxmlformats.org/drawingml/2006/main" xmlns:pic="http://schemas.openxmlformats.org/drawingml/2006/picture" xmlns:wp="http://schemas.openxmlformats.org/drawingml/2006/wordprocessingDrawing">
   <w:body>
-    <w:bookmarkStart w:id="9" w:name="abstract"/>
+    <w:bookmarkStart w:id="9" w:name="Xda4498fbe9adb815d44efc6e759d353f2c6f3b0"/>
+    <w:p>
+      <w:pPr>
+        <w:pStyle w:val="Heading1"/>
+      </w:pPr>
+      <w:r>
+        <w:t xml:space="preserve">Deep Reinforcement Learning Vulnerability Scanner for Modern Web Applications</w:t>
+      </w:r>
+    </w:p>
+    <w:bookmarkEnd w:id="9"/>
+    <w:bookmarkStart w:id="10" w:name="abstract"/>
     <w:p>
       <w:pPr>
         <w:pStyle w:val="Heading1"/>
@@ -26,8 +36,8 @@
         </w:pict>
       </w:r>
     </w:p>
-    <w:bookmarkEnd w:id="9"/>
-    <w:bookmarkStart w:id="10" w:name="i.-introduction"/>
+    <w:bookmarkEnd w:id="10"/>
+    <w:bookmarkStart w:id="11" w:name="i.-introduction"/>
     <w:p>
       <w:pPr>
         <w:pStyle w:val="Heading1"/>
@@ -79,8 +89,8 @@
         </w:pict>
       </w:r>
     </w:p>
-    <w:bookmarkEnd w:id="10"/>
-    <w:bookmarkStart w:id="14" w:name="ii.-related-work"/>
+    <w:bookmarkEnd w:id="11"/>
+    <w:bookmarkStart w:id="15" w:name="ii.-related-work"/>
     <w:p>
       <w:pPr>
         <w:pStyle w:val="Heading1"/>
@@ -97,7 +107,7 @@
         <w:t xml:space="preserve">The intersection of artificial intelligence and cybersecurity has seen significant growth over the years. This section reviews the existing research surrounding web application security testing, the transition from manual to automated methods, and the growing role of Deep Reinforcement Learning (DRL) in penetration testing.</w:t>
       </w:r>
     </w:p>
-    <w:bookmarkStart w:id="11" w:name="X8b4137e7aaa471a7bd5c8bfd868e73d8aa6c7b2"/>
+    <w:bookmarkStart w:id="12" w:name="X8b4137e7aaa471a7bd5c8bfd868e73d8aa6c7b2"/>
     <w:p>
       <w:pPr>
         <w:pStyle w:val="Heading2"/>
@@ -146,8 +156,8 @@
         <w:t xml:space="preserve">scanners that can actually learn and adapt their strategies dynamically.</w:t>
       </w:r>
     </w:p>
-    <w:bookmarkEnd w:id="11"/>
-    <w:bookmarkStart w:id="12" w:name="X90adb92d7234c0b08f384b330e1160940423868"/>
+    <w:bookmarkEnd w:id="12"/>
+    <w:bookmarkStart w:id="13" w:name="X90adb92d7234c0b08f384b330e1160940423868"/>
     <w:p>
       <w:pPr>
         <w:pStyle w:val="Heading2"/>
@@ -172,8 +182,8 @@
         <w:t xml:space="preserve">The foundation for these advanced DRL applications comes from major breakthroughs in AI. Mnih et al. demonstrated that a deep Q-network (DQN) could achieve human-level performance across many different tasks using only raw inputs and rewards, establishing a new gold standard for autonomous decision-making [5].</w:t>
       </w:r>
     </w:p>
-    <w:bookmarkEnd w:id="12"/>
-    <w:bookmarkStart w:id="13" w:name="X6a07811c902d2d0ac4c54d1af50f8aa41afe363"/>
+    <w:bookmarkEnd w:id="13"/>
+    <w:bookmarkStart w:id="14" w:name="X6a07811c902d2d0ac4c54d1af50f8aa41afe363"/>
     <w:p>
       <w:pPr>
         <w:pStyle w:val="Heading2"/>
@@ -265,9 +275,9 @@
         </w:pict>
       </w:r>
     </w:p>
-    <w:bookmarkEnd w:id="13"/>
     <w:bookmarkEnd w:id="14"/>
-    <w:bookmarkStart w:id="22" w:name="iii.-methodology"/>
+    <w:bookmarkEnd w:id="15"/>
+    <w:bookmarkStart w:id="26" w:name="iii.-methodology"/>
     <w:p>
       <w:pPr>
         <w:pStyle w:val="Heading1"/>
@@ -284,7 +294,7 @@
         <w:t xml:space="preserve">Our system is designed to separate the Artificial Intelligence logic from the actual web requests. The core components include the system architecture, how we formulated the problem for the AI, the design of the RL agent, and the training algorithm.</w:t>
       </w:r>
     </w:p>
-    <w:bookmarkStart w:id="15" w:name="a.-system-architecture"/>
+    <w:bookmarkStart w:id="19" w:name="a.-system-architecture"/>
     <w:p>
       <w:pPr>
         <w:pStyle w:val="Heading2"/>
@@ -295,10 +305,77 @@
     </w:p>
     <w:p>
       <w:pPr>
-        <w:pStyle w:val="FirstParagraph"/>
-      </w:pPr>
-      <w:r>
-        <w:t xml:space="preserve">At a high level, the system consists of three main parts:</w:t>
+        <w:pStyle w:val="CaptionedFigure"/>
+      </w:pPr>
+      <w:r>
+        <w:drawing>
+          <wp:inline>
+            <wp:extent cx="5334000" cy="5688263"/>
+            <wp:effectExtent b="0" l="0" r="0" t="0"/>
+            <wp:docPr descr="D3QN Vulnerability Finder Architecture" title="" id="17" name="Picture"/>
+            <a:graphic>
+              <a:graphicData uri="http://schemas.openxmlformats.org/drawingml/2006/picture">
+                <pic:pic>
+                  <pic:nvPicPr>
+                    <pic:cNvPr descr="D3QN%20vuln%20finder.png" id="18" name="Picture"/>
+                    <pic:cNvPicPr>
+                      <a:picLocks noChangeArrowheads="1" noChangeAspect="1"/>
+                    </pic:cNvPicPr>
+                  </pic:nvPicPr>
+                  <pic:blipFill>
+                    <a:blip r:embed="rId16"/>
+                    <a:stretch>
+                      <a:fillRect/>
+                    </a:stretch>
+                  </pic:blipFill>
+                  <pic:spPr bwMode="auto">
+                    <a:xfrm>
+                      <a:off x="0" y="0"/>
+                      <a:ext cx="5334000" cy="5688263"/>
+                    </a:xfrm>
+                    <a:prstGeom prst="rect">
+                      <a:avLst/>
+                    </a:prstGeom>
+                    <a:noFill/>
+                    <a:ln w="9525">
+                      <a:noFill/>
+                      <a:headEnd/>
+                      <a:tailEnd/>
+                    </a:ln>
+                  </pic:spPr>
+                </pic:pic>
+              </a:graphicData>
+            </a:graphic>
+          </wp:inline>
+        </w:drawing>
+      </w:r>
+    </w:p>
+    <w:p>
+      <w:pPr>
+        <w:pStyle w:val="ImageCaption"/>
+      </w:pPr>
+      <w:r>
+        <w:t xml:space="preserve">D3QN Vulnerability Finder Architecture</w:t>
+      </w:r>
+    </w:p>
+    <w:p>
+      <w:pPr>
+        <w:pStyle w:val="BodyText"/>
+      </w:pPr>
+      <w:r>
+        <w:t xml:space="preserve">The vulnerability scanner uses a clear, modular design to separate the AI’s</w:t>
+      </w:r>
+      <w:r>
+        <w:t xml:space="preserve"> </w:t>
+      </w:r>
+      <w:r>
+        <w:t xml:space="preserve">“brain”</w:t>
+      </w:r>
+      <w:r>
+        <w:t xml:space="preserve"> </w:t>
+      </w:r>
+      <w:r>
+        <w:t xml:space="preserve">from the actual web request engine. The system is built around three main parts:</w:t>
       </w:r>
     </w:p>
     <w:p>
@@ -370,8 +447,8 @@
         <w:t xml:space="preserve">: For safe training, we built several deliberately vulnerable web applications (such as an E-commerce store and a Banking portal) that respond realistically to the agent’s attacks.</w:t>
       </w:r>
     </w:p>
-    <w:bookmarkEnd w:id="15"/>
-    <w:bookmarkStart w:id="18" w:name="b.-formulating-the-problem-for-ai"/>
+    <w:bookmarkEnd w:id="19"/>
+    <w:bookmarkStart w:id="22" w:name="b.-formulating-the-problem-for-ai"/>
     <w:p>
       <w:pPr>
         <w:pStyle w:val="Heading2"/>
@@ -424,7 +501,7 @@
         <w:t xml:space="preserve">it receives (Reward).</w:t>
       </w:r>
     </w:p>
-    <w:bookmarkStart w:id="16" w:name="state-representation"/>
+    <w:bookmarkStart w:id="20" w:name="state-representation"/>
     <w:p>
       <w:pPr>
         <w:pStyle w:val="Heading3"/>
@@ -498,8 +575,8 @@
         <w:t xml:space="preserve">: Whether the website leaked a database error or if a firewall blocked the request.</w:t>
       </w:r>
     </w:p>
-    <w:bookmarkEnd w:id="16"/>
-    <w:bookmarkStart w:id="17" w:name="action-space"/>
+    <w:bookmarkEnd w:id="20"/>
+    <w:bookmarkStart w:id="21" w:name="action-space"/>
     <w:p>
       <w:pPr>
         <w:pStyle w:val="Heading3"/>
@@ -585,9 +662,9 @@
         <w:t xml:space="preserve">: Dropping complex, weaponized payloads aimed at triggering SQL Injection or XSS.</w:t>
       </w:r>
     </w:p>
-    <w:bookmarkEnd w:id="17"/>
-    <w:bookmarkEnd w:id="18"/>
-    <w:bookmarkStart w:id="21" w:name="c.-agent-design"/>
+    <w:bookmarkEnd w:id="21"/>
+    <w:bookmarkEnd w:id="22"/>
+    <w:bookmarkStart w:id="25" w:name="c.-agent-design"/>
     <w:p>
       <w:pPr>
         <w:pStyle w:val="Heading2"/>
@@ -905,7 +982,7 @@
         <w:t xml:space="preserve">calculates rewards over several future steps (rather than just the single next step), allowing the agent to figure out which initial vulnerability (like a minor configuration flaw) led to a massive payoff (like a full database breach) much later in the attack chain.</w:t>
       </w:r>
     </w:p>
-    <w:bookmarkStart w:id="19" w:name="reward-function"/>
+    <w:bookmarkStart w:id="23" w:name="reward-function"/>
     <w:p>
       <w:pPr>
         <w:pStyle w:val="Heading3"/>
@@ -1040,8 +1117,8 @@
         <w:t xml:space="preserve">), which forces the agent to learn to act stealthily.</w:t>
       </w:r>
     </w:p>
-    <w:bookmarkEnd w:id="19"/>
-    <w:bookmarkStart w:id="20" w:name="phase-based-training-algorithm"/>
+    <w:bookmarkEnd w:id="23"/>
+    <w:bookmarkStart w:id="24" w:name="phase-based-training-algorithm"/>
     <w:p>
       <w:pPr>
         <w:pStyle w:val="Heading3"/>
@@ -1232,10 +1309,10 @@
         </w:pict>
       </w:r>
     </w:p>
-    <w:bookmarkEnd w:id="20"/>
-    <w:bookmarkEnd w:id="21"/>
-    <w:bookmarkEnd w:id="22"/>
-    <w:bookmarkStart w:id="23" w:name="iv.-evaluation-and-results"/>
+    <w:bookmarkEnd w:id="24"/>
+    <w:bookmarkEnd w:id="25"/>
+    <w:bookmarkEnd w:id="26"/>
+    <w:bookmarkStart w:id="27" w:name="iv.-evaluation-and-results"/>
     <w:p>
       <w:pPr>
         <w:pStyle w:val="Heading1"/>
@@ -3070,6 +3147,155 @@
         <w:t xml:space="preserve">That being said, the evaluation does shine a light on where the agent struggles. Complex logic vulnerabilities, such as Insecure Direct Object Reference (IDOR), were incredibly difficult for the agent to spot consistently. These flaws often require deep, contextual understanding of what user data belongs to whom across multiple sequential requests. Additionally, complex multi-step exploits like uploading a malicious file and then subsequently triggering it via path traversal proved difficult. This suggests that while RL is incredible at chaining payloads on a syntax level, giving it true abstract business-logic comprehension represents the next major hurdle for completely autonomous pentesting.</w:t>
       </w:r>
     </w:p>
+    <w:bookmarkEnd w:id="27"/>
+    <w:bookmarkStart w:id="33" w:name="v.-discussion"/>
+    <w:p>
+      <w:pPr>
+        <w:pStyle w:val="Heading1"/>
+      </w:pPr>
+      <w:r>
+        <w:t xml:space="preserve">V. DISCUSSION</w:t>
+      </w:r>
+    </w:p>
+    <w:bookmarkStart w:id="31" w:name="a.-experimental-setup"/>
+    <w:p>
+      <w:pPr>
+        <w:pStyle w:val="Heading2"/>
+      </w:pPr>
+      <w:r>
+        <w:t xml:space="preserve">A. Experimental Setup</w:t>
+      </w:r>
+    </w:p>
+    <w:p>
+      <w:pPr>
+        <w:pStyle w:val="FirstParagraph"/>
+      </w:pPr>
+      <w:r>
+        <w:t xml:space="preserve">To validate the proposed Extended D3QN framework, the autonomous scanner and target environments were deployed and evaluated locally. The RL agent was trained over 10,000 algorithmic episodes. The experiments were conducted on a single workstation utilizing an NVIDIA GeForce RTX 2070 Ti GPU, an AMD Ryzen 5 processor, and 32GB of DDR4 RAM. The target mock applications were hosted on the</w:t>
+      </w:r>
+      <w:r>
+        <w:t xml:space="preserve"> </w:t>
+      </w:r>
+      <w:r>
+        <w:rPr>
+          <w:rStyle w:val="VerbatimChar"/>
+        </w:rPr>
+        <w:t xml:space="preserve">localhost</w:t>
+      </w:r>
+      <w:r>
+        <w:t xml:space="preserve"> </w:t>
+      </w:r>
+      <w:r>
+        <w:t xml:space="preserve">network to eliminate external latency variances, allowing for a controlled, high-throughput training pipeline. Training utilized a mini-batch size of 64 transitions and a learning rate of</w:t>
+      </w:r>
+      <w:r>
+        <w:t xml:space="preserve"> </w:t>
+      </w:r>
+      <m:oMath>
+        <m:sSup>
+          <m:e>
+            <m:r>
+              <m:t>10</m:t>
+            </m:r>
+          </m:e>
+          <m:sup>
+            <m:r>
+              <m:rPr>
+                <m:sty m:val="p"/>
+              </m:rPr>
+              <m:t>−</m:t>
+            </m:r>
+            <m:r>
+              <m:t>4</m:t>
+            </m:r>
+          </m:sup>
+        </m:sSup>
+      </m:oMath>
+      <w:r>
+        <w:t xml:space="preserve">, with the exploration rate exponentially decaying from 1.0 down to a minimum of 0.01.</w:t>
+      </w:r>
+    </w:p>
+    <w:p>
+      <w:pPr>
+        <w:pStyle w:val="CaptionedFigure"/>
+      </w:pPr>
+      <w:r>
+        <w:drawing>
+          <wp:inline>
+            <wp:extent cx="5334000" cy="2632876"/>
+            <wp:effectExtent b="0" l="0" r="0" t="0"/>
+            <wp:docPr descr="Agent Training Progression" title="" id="29" name="Picture"/>
+            <a:graphic>
+              <a:graphicData uri="http://schemas.openxmlformats.org/drawingml/2006/picture">
+                <pic:pic>
+                  <pic:nvPicPr>
+                    <pic:cNvPr descr="training_curve.png" id="30" name="Picture"/>
+                    <pic:cNvPicPr>
+                      <a:picLocks noChangeArrowheads="1" noChangeAspect="1"/>
+                    </pic:cNvPicPr>
+                  </pic:nvPicPr>
+                  <pic:blipFill>
+                    <a:blip r:embed="rId28"/>
+                    <a:stretch>
+                      <a:fillRect/>
+                    </a:stretch>
+                  </pic:blipFill>
+                  <pic:spPr bwMode="auto">
+                    <a:xfrm>
+                      <a:off x="0" y="0"/>
+                      <a:ext cx="5334000" cy="2632876"/>
+                    </a:xfrm>
+                    <a:prstGeom prst="rect">
+                      <a:avLst/>
+                    </a:prstGeom>
+                    <a:noFill/>
+                    <a:ln w="9525">
+                      <a:noFill/>
+                      <a:headEnd/>
+                      <a:tailEnd/>
+                    </a:ln>
+                  </pic:spPr>
+                </pic:pic>
+              </a:graphicData>
+            </a:graphic>
+          </wp:inline>
+        </w:drawing>
+      </w:r>
+    </w:p>
+    <w:p>
+      <w:pPr>
+        <w:pStyle w:val="ImageCaption"/>
+      </w:pPr>
+      <w:r>
+        <w:t xml:space="preserve">Agent Training Progression</w:t>
+      </w:r>
+    </w:p>
+    <w:p>
+      <w:pPr>
+        <w:pStyle w:val="BodyText"/>
+      </w:pPr>
+      <w:r>
+        <w:t xml:space="preserve">The learning progression of the Extensive D3QN agent over the 10,000 training episodes demonstrates rapid initial exploration characterized by high variance due to WAF penalties, followed by steady convergence as the agent discovers high-value exploitation chains.</w:t>
+      </w:r>
+    </w:p>
+    <w:bookmarkEnd w:id="31"/>
+    <w:bookmarkStart w:id="32" w:name="b.-limitations"/>
+    <w:p>
+      <w:pPr>
+        <w:pStyle w:val="Heading2"/>
+      </w:pPr>
+      <w:r>
+        <w:t xml:space="preserve">B. Limitations</w:t>
+      </w:r>
+    </w:p>
+    <w:p>
+      <w:pPr>
+        <w:pStyle w:val="FirstParagraph"/>
+      </w:pPr>
+      <w:r>
+        <w:t xml:space="preserve">While the agent demonstrates significant efficacy in discovering injection flaws and state-based vulnerabilities, several limitations remain. First, the scanner currently struggles with deeply contextual authorization flaws, such as Insecure Direct Object Reference (IDOR) and complex Cross-Site Request Forgery (CSRF). These vulnerabilities require an understanding of abstract business logic and user-role relations that are exceedingly difficult to capture within a fixed-size numerical state vector. Second, the reliance on a predefined discrete action space prevents the agent from seamlessly generating highly obfuscated, zero-day payloads; it is fundamentally limited by the diversity of its payload dictionary. Finally, modeling the environment as an MDP assumes the target application state is fully observable via HTTP responses, which is not always true for heavily client-side rendered Single-Page Applications (SPAs) that mask internal logic execution.</w:t>
+      </w:r>
+    </w:p>
     <w:p>
       <w:r>
         <w:pict>
@@ -3077,8 +3303,9 @@
         </w:pict>
       </w:r>
     </w:p>
-    <w:bookmarkEnd w:id="23"/>
-    <w:bookmarkStart w:id="24" w:name="vi.-conclusion"/>
+    <w:bookmarkEnd w:id="32"/>
+    <w:bookmarkEnd w:id="33"/>
+    <w:bookmarkStart w:id="34" w:name="vi.-conclusion"/>
     <w:p>
       <w:pPr>
         <w:pStyle w:val="Heading1"/>
@@ -3092,7 +3319,22 @@
         <w:pStyle w:val="FirstParagraph"/>
       </w:pPr>
       <w:r>
-        <w:t xml:space="preserve">In this paper, we introduced an autonomous web vulnerability scanner driven by an Extended Double Dueling Deep Q-Network (Extended D3QN) agent. By treating web exploitation as a formalized game environment, we’ve shown that Reinforcement Learning can successfully replicate the cognitive adaptability of a human penetration tester at scale. Thanks to our Phase-Based Learning implementation, the agent seamlessly learned to navigate the Cyber Kill Chain—moving from reconnaissance to the execution of deep exploit chains like XSS and SQLi.</w:t>
+        <w:t xml:space="preserve">This paper presented an autonomous web vulnerability scanner driven by an Extended Double Dueling Deep Q-Network (Extended D3QN) agent. By formalizing the web exploitation process as a Markov Decision Process (MDP) and training the agent in a custom</w:t>
+      </w:r>
+      <w:r>
+        <w:t xml:space="preserve"> </w:t>
+      </w:r>
+      <w:r>
+        <w:rPr>
+          <w:rStyle w:val="VerbatimChar"/>
+        </w:rPr>
+        <w:t xml:space="preserve">WebSecurityGym</w:t>
+      </w:r>
+      <w:r>
+        <w:t xml:space="preserve"> </w:t>
+      </w:r>
+      <w:r>
+        <w:t xml:space="preserve">environment, we demonstrated that Reinforcement Learning can effectively replicate and scale the cognitive processes of human penetration testers. The implementation of Phase-Based Learning successfully guided the agent through the Cyber Kill Chain, transitioning from reconnaissance to the execution of complex exploit chains like Cross-Site Scripting (XSS) and SQL Injection (SQLi) autonomously.</w:t>
       </w:r>
     </w:p>
     <w:p>
@@ -3100,7 +3342,7 @@
         <w:pStyle w:val="BodyText"/>
       </w:pPr>
       <w:r>
-        <w:t xml:space="preserve">Our testing against multiple deliberately vulnerable mock endpoints proves that the system strongly balances finding real flaws while keeping noise and false positives heavily minimized. It routinely outperformed traditional heuristic-based scanners when it came to efficiency, proving its ability to adapt dynamically to defensive mechanisms like simulated firewalls.</w:t>
+        <w:t xml:space="preserve">Our experimental evaluations against a diverse set of deliberately vulnerable mock applications underscore the system’s proficiency in maximizing vulnerability discovery while minimizing noisy, brute-force behavior. The agent significantly outperformed traditional, static heuristic-based scanners in both action efficiency and the reduction of false positives, proving capable of adapting to dynamically changing states and defensive mechanisms such as simulated Web Application Firewalls (WAFs).</w:t>
       </w:r>
     </w:p>
     <w:p>
@@ -3108,7 +3350,7 @@
         <w:pStyle w:val="BodyText"/>
       </w:pPr>
       <w:r>
-        <w:t xml:space="preserve">Moving forward, our immediate focus will be on dramatically expanding the agent’s action abilities to cover far more sophisticated flaws. Additionally, we believe bridging this RL orchestrator with Large Language Models (LLMs) could drastically improve its contextual understanding of HTTP responses, finally closing the gap between structural pattern recognition and human-like logic comprehension. Ultimately, this research lays down a solid foundation for the next massive leap in intelligent, adaptive, and scalable automated pentesting frameworks.</w:t>
+        <w:t xml:space="preserve">Future work will focus on expanding the agent’s action space to encompass a broader array of sophisticated common vulnerabilities and exposures (CVEs). Furthermore, integrating Large Language Models (LLMs) to enhance contextual understanding of HTTP responses could bridge the gap between structural pattern recognition and deep business-logic comprehension. Ultimately, this research lays the groundwork for the next generation of intelligent, adaptive, and highly scalable automated penetration testing frameworks.</w:t>
       </w:r>
     </w:p>
     <w:p>
@@ -3118,8 +3360,8 @@
         </w:pict>
       </w:r>
     </w:p>
-    <w:bookmarkEnd w:id="24"/>
-    <w:bookmarkStart w:id="25" w:name="references"/>
+    <w:bookmarkEnd w:id="34"/>
+    <w:bookmarkStart w:id="35" w:name="references"/>
     <w:p>
       <w:pPr>
         <w:pStyle w:val="Heading1"/>
@@ -3364,7 +3606,7 @@
         <w:t xml:space="preserve">Arizona State University.</w:t>
       </w:r>
     </w:p>
-    <w:bookmarkEnd w:id="25"/>
+    <w:bookmarkEnd w:id="35"/>
     <w:sectPr>
       <w:footnotePr>
         <w:numRestart w:val="eachSect"/>

</xml_diff>

<commit_message>
feat: Add initial research paper drafts, supporting materials, and a PDF extraction utility script.
</commit_message>
<xml_diff>
--- a/research/Bachelor_Paper_Draft.docx
+++ b/research/Bachelor_Paper_Draft.docx
@@ -31,7 +31,7 @@
     </w:p>
     <w:p>
       <w:r>
-        <w:pict w14:anchorId="18686C5C">
+        <w:pict w14:anchorId="196D073A">
           <v:rect id="_x0000_i1025" style="width:0;height:1.5pt" o:hralign="center" o:hrstd="t" o:hr="t"/>
         </w:pict>
       </w:r>
@@ -76,7 +76,7 @@
     </w:p>
     <w:p>
       <w:r>
-        <w:pict w14:anchorId="7911CD80">
+        <w:pict w14:anchorId="06BB0641">
           <v:rect id="_x0000_i1026" style="width:0;height:1.5pt" o:hralign="center" o:hrstd="t" o:hr="t"/>
         </w:pict>
       </w:r>
@@ -177,12 +177,13 @@
         <w:pStyle w:val="BodyText"/>
       </w:pPr>
       <w:r>
-        <w:t>In automated penetration testing, researchers are using these advanced techniques to train intelligent agents capable of discovering vulnerabilities. Recent studies, such as the Intelligent Automated Penetration Testing Framework (IAPTF) by Ghanem et al., have successfully used reinforcement learning to automate step-by-step decision-making in security assessments. By modeling hacking as a Partially Observable Markov Decision Process (POMDP), IAPTF showed it could discover multi-step vulnerabilities in complex networks while integrating with established toolkits like Metasploit [7]. Similarly, systems like ASAP combine Deep Q-Networks with Attack Graphs to automatically generate non-intuitive pathways to penetrate large enterprise networks [14]. Other modern tools are pushing these boundaries further; “Pentest-R1” pairs AI reasoning (like ChatGPT) with RL to navigate complex capture-the-flag environments [8], while frameworks like “Re-Pen” apply these identical RL mechanics to find physical hardware flaws in microchips [9]. To prevent automated agents from “forgetting” past environments, tools like SCRIPT use continual RL for dynamic networks [10]. Moreover, recent systematic reviews confirm that applying RL to penetration testing is becoming essential to handle modern cyber threats [11]. These “Red Team” algorithms map the hacking process to a mathematical game, where the agent learns the best sequence of attacks to navigate environments and exploit vulnerabilities. While existing research has proven DRL works well for network-level intrusion detection and specific web service attacks, comprehensive scanners that address the full spectrum of modern web vulnerabilities utilizing an Extended Double Dueling Deep Q-Network (Extended D3QN) remain a largely unexplored area. Our work bridges this gap by implementing an Extended D3QN agent with PER and Noisy Networks specifically designed for autonomous web vulnerability scanning.</w:t>
-      </w:r>
-    </w:p>
-    <w:p>
-      <w:r>
-        <w:pict w14:anchorId="3B059DAA">
+        <w:t>In automated penetration testing, researchers are using these advanced techniques to train intelligent agents capable of discovering vulnerabilities. Recent studies, such as the Intelligent Automated Penetration Testing Framework (IAPTF) by Ghanem et al., have successfully used reinforcement learning to automate step-by-step decision-making in security assessments. By modeling hacking as a Partially Observable Markov Decision Process (POMDP), IAPTF showed it could discover multi-step vulnerabilities in complex networks while integrating with established toolkits like Metasploit [7]. Similarly, systems like ASAP combine Deep Q-Networks with Attack Graphs to automatically generate non-intuitive pathways to penetrate large enterprise networks [14]. Other modern tools are pushing these boundaries further; “Pentest-R1” pairs AI reasoning (like ChatGPT) with RL to navigate complex capture-the-flag environments [8], while frameworks like “Re-Pen” apply these identical RL mechanics to find physical hardware flaws in microchips [9]. To prevent automated agents from “forgetting” past environments, tools like SCRIPT use continual RL for dynamic networks [10]. Moreover, recent systematic reviews confirm that applying RL to penetration testing is becoming essential to handle modern cyber threats [11]. Similarly, recent comparative studies have evaluated the effectiveness of various RL algorithms—such as Deep Q-Network (DQN), Deep Deterministic Policy Gradient (DDPG), and Asynchronous Episodic DDPG (AE-DDPG)—in automating penetration testing tasks by dynamically identifying critical network vulnerabilities [15]. These “Red Team” algorithms map the hacking process to a mathematical game, where the agent learns the best sequence of attacks to navigate environments and exploit vulnerabilities. While existing research has proven DRL works well for network-level intrusion detection and specific web service attacks, comprehensive scanners that address the full spectrum of modern web vulnerabilities utilizing an Extended Double Dueling Deep Q-Network (Extended D3QN) remain a largely unexplored area. Our work bridges this gap by implementing an Extended D3QN agent with PER and Noisy Networks specifically designed for autonomous web vulnerability scanning.</w:t>
+      </w:r>
+    </w:p>
+    <w:p>
+      <w:r>
+        <w:lastRenderedPageBreak/>
+        <w:pict w14:anchorId="4FEB9858">
           <v:rect id="_x0000_i1027" style="width:0;height:1.5pt" o:hralign="center" o:hrstd="t" o:hr="t"/>
         </w:pict>
       </w:r>
@@ -195,7 +196,6 @@
       <w:bookmarkEnd w:id="3"/>
       <w:bookmarkEnd w:id="6"/>
       <w:r>
-        <w:lastRenderedPageBreak/>
         <w:t>III. METHODOLOGY</w:t>
       </w:r>
     </w:p>
@@ -225,31 +225,22 @@
           <w:noProof/>
         </w:rPr>
         <w:drawing>
-          <wp:inline distT="0" distB="0" distL="0" distR="0" wp14:anchorId="2E8C1690" wp14:editId="72959914">
-            <wp:extent cx="5935980" cy="5951220"/>
+          <wp:inline distT="0" distB="0" distL="0" distR="0" wp14:anchorId="1C4052AB" wp14:editId="6AB036C5">
+            <wp:extent cx="5334000" cy="5347418"/>
             <wp:effectExtent l="0" t="0" r="0" b="0"/>
-            <wp:docPr id="37151761" name="Picture 1"/>
-            <wp:cNvGraphicFramePr>
-              <a:graphicFrameLocks xmlns:a="http://schemas.openxmlformats.org/drawingml/2006/main" noChangeAspect="1"/>
-            </wp:cNvGraphicFramePr>
+            <wp:docPr id="17" name="Picture" descr="D3QN Vulnerability Finder Architecture"/>
+            <wp:cNvGraphicFramePr/>
             <a:graphic xmlns:a="http://schemas.openxmlformats.org/drawingml/2006/main">
               <a:graphicData uri="http://schemas.openxmlformats.org/drawingml/2006/picture">
                 <pic:pic xmlns:pic="http://schemas.openxmlformats.org/drawingml/2006/picture">
                   <pic:nvPicPr>
-                    <pic:cNvPr id="0" name="Picture 7"/>
+                    <pic:cNvPr id="18" name="Picture" descr="D3QN%20vuln%20finder.png"/>
                     <pic:cNvPicPr>
                       <a:picLocks noChangeAspect="1" noChangeArrowheads="1"/>
                     </pic:cNvPicPr>
                   </pic:nvPicPr>
                   <pic:blipFill>
-                    <a:blip r:embed="rId5">
-                      <a:extLst>
-                        <a:ext uri="{28A0092B-C50C-407E-A947-70E740481C1C}">
-                          <a14:useLocalDpi xmlns:a14="http://schemas.microsoft.com/office/drawing/2010/main" val="0"/>
-                        </a:ext>
-                      </a:extLst>
-                    </a:blip>
-                    <a:srcRect/>
+                    <a:blip r:embed="rId5"/>
                     <a:stretch>
                       <a:fillRect/>
                     </a:stretch>
@@ -257,14 +248,16 @@
                   <pic:spPr bwMode="auto">
                     <a:xfrm>
                       <a:off x="0" y="0"/>
-                      <a:ext cx="5935980" cy="5951220"/>
+                      <a:ext cx="5334000" cy="5347418"/>
                     </a:xfrm>
                     <a:prstGeom prst="rect">
                       <a:avLst/>
                     </a:prstGeom>
                     <a:noFill/>
-                    <a:ln>
+                    <a:ln w="9525">
                       <a:noFill/>
+                      <a:headEnd/>
+                      <a:tailEnd/>
                     </a:ln>
                   </pic:spPr>
                 </pic:pic>
@@ -971,61 +964,85 @@
         <w:t>To prevent the agent from randomly guessing complex exploits before it understands the website, we use a phase-based system. The agent starts in Phase 0 and must prove it can find basics before unlocking Phase 2.</w:t>
       </w:r>
     </w:p>
+    <w:p>
+      <w:pPr>
+        <w:pStyle w:val="BodyText"/>
+      </w:pPr>
+    </w:p>
+    <w:p>
+      <w:pPr>
+        <w:pStyle w:val="BodyText"/>
+      </w:pPr>
+    </w:p>
+    <w:p>
+      <w:pPr>
+        <w:pStyle w:val="BodyText"/>
+      </w:pPr>
+    </w:p>
+    <w:p>
+      <w:pPr>
+        <w:pStyle w:val="BodyText"/>
+      </w:pPr>
+    </w:p>
     <w:tbl>
       <w:tblPr>
         <w:tblStyle w:val="TableGrid"/>
-        <w:tblW w:w="10548" w:type="dxa"/>
+        <w:tblW w:w="5000" w:type="pct"/>
+        <w:tblBorders>
+          <w:top w:val="none" w:sz="0" w:space="0" w:color="auto"/>
+          <w:left w:val="none" w:sz="0" w:space="0" w:color="auto"/>
+          <w:bottom w:val="none" w:sz="0" w:space="0" w:color="auto"/>
+          <w:right w:val="none" w:sz="0" w:space="0" w:color="auto"/>
+          <w:insideH w:val="none" w:sz="0" w:space="0" w:color="auto"/>
+          <w:insideV w:val="none" w:sz="0" w:space="0" w:color="auto"/>
+        </w:tblBorders>
         <w:tblLook w:val="0420" w:firstRow="1" w:lastRow="0" w:firstColumn="0" w:lastColumn="0" w:noHBand="0" w:noVBand="1"/>
       </w:tblPr>
       <w:tblGrid>
         <w:gridCol w:w="648"/>
-        <w:gridCol w:w="9900"/>
+        <w:gridCol w:w="8461"/>
+        <w:gridCol w:w="467"/>
       </w:tblGrid>
       <w:tr>
-        <w:tc>
-          <w:tcPr>
-            <w:tcW w:w="648" w:type="dxa"/>
+        <w:trPr>
+          <w:gridAfter w:val="1"/>
+          <w:wAfter w:w="244" w:type="pct"/>
+        </w:trPr>
+        <w:tc>
+          <w:tcPr>
+            <w:tcW w:w="4756" w:type="pct"/>
+            <w:gridSpan w:val="2"/>
+            <w:tcBorders>
+              <w:top w:val="single" w:sz="4" w:space="0" w:color="auto"/>
+            </w:tcBorders>
           </w:tcPr>
           <w:p>
             <w:pPr>
               <w:pStyle w:val="BodyText"/>
+            </w:pPr>
+            <w:r>
               <w:rPr>
                 <w:b/>
                 <w:bCs/>
               </w:rPr>
-            </w:pPr>
-          </w:p>
-        </w:tc>
-        <w:tc>
-          <w:tcPr>
-            <w:tcW w:w="9900" w:type="dxa"/>
-          </w:tcPr>
-          <w:p>
-            <w:pPr>
-              <w:pStyle w:val="BodyText"/>
-            </w:pPr>
-            <w:r>
-              <w:rPr>
-                <w:b/>
-                <w:bCs/>
-              </w:rPr>
+              <w:lastRenderedPageBreak/>
               <w:t>Algorithm 1: Phase-Based Extended D3QN Training Process</w:t>
             </w:r>
           </w:p>
         </w:tc>
       </w:tr>
       <w:tr>
-        <w:tc>
-          <w:tcPr>
-            <w:tcW w:w="648" w:type="dxa"/>
-            <w:tcBorders>
-              <w:left w:val="nil"/>
-            </w:tcBorders>
+        <w:trPr>
+          <w:trHeight w:val="8640"/>
+        </w:trPr>
+        <w:tc>
+          <w:tcPr>
+            <w:tcW w:w="338" w:type="pct"/>
+            <w:shd w:val="clear" w:color="auto" w:fill="FFFFFF" w:themeFill="background1"/>
           </w:tcPr>
           <w:p>
             <w:pPr>
               <w:pStyle w:val="SourceCode"/>
-              <w:jc w:val="right"/>
               <w:rPr>
                 <w:rStyle w:val="VerbatimChar"/>
               </w:rPr>
@@ -1040,7 +1057,6 @@
           <w:p>
             <w:pPr>
               <w:pStyle w:val="SourceCode"/>
-              <w:jc w:val="right"/>
               <w:rPr>
                 <w:rStyle w:val="VerbatimChar"/>
               </w:rPr>
@@ -1055,7 +1071,6 @@
           <w:p>
             <w:pPr>
               <w:pStyle w:val="SourceCode"/>
-              <w:jc w:val="right"/>
               <w:rPr>
                 <w:rStyle w:val="VerbatimChar"/>
               </w:rPr>
@@ -1070,7 +1085,6 @@
           <w:p>
             <w:pPr>
               <w:pStyle w:val="SourceCode"/>
-              <w:jc w:val="right"/>
               <w:rPr>
                 <w:rStyle w:val="VerbatimChar"/>
               </w:rPr>
@@ -1085,7 +1099,14 @@
           <w:p>
             <w:pPr>
               <w:pStyle w:val="SourceCode"/>
-              <w:jc w:val="right"/>
+              <w:rPr>
+                <w:rStyle w:val="VerbatimChar"/>
+              </w:rPr>
+            </w:pPr>
+          </w:p>
+          <w:p>
+            <w:pPr>
+              <w:pStyle w:val="SourceCode"/>
               <w:rPr>
                 <w:rStyle w:val="VerbatimChar"/>
               </w:rPr>
@@ -1100,46 +1121,42 @@
           <w:p>
             <w:pPr>
               <w:pStyle w:val="SourceCode"/>
-              <w:jc w:val="right"/>
-              <w:rPr>
-                <w:rStyle w:val="VerbatimChar"/>
-              </w:rPr>
-            </w:pPr>
+              <w:rPr>
+                <w:rStyle w:val="VerbatimChar"/>
+              </w:rPr>
+            </w:pPr>
+            <w:r>
+              <w:rPr>
+                <w:rStyle w:val="VerbatimChar"/>
+              </w:rPr>
+              <w:t>6:</w:t>
+            </w:r>
           </w:p>
           <w:p>
             <w:pPr>
               <w:pStyle w:val="SourceCode"/>
-              <w:jc w:val="right"/>
-              <w:rPr>
-                <w:rStyle w:val="VerbatimChar"/>
-              </w:rPr>
-            </w:pPr>
-            <w:r>
-              <w:rPr>
-                <w:rStyle w:val="VerbatimChar"/>
-              </w:rPr>
-              <w:t>6:</w:t>
+              <w:rPr>
+                <w:rStyle w:val="VerbatimChar"/>
+              </w:rPr>
+            </w:pPr>
+            <w:r>
+              <w:rPr>
+                <w:rStyle w:val="VerbatimChar"/>
+              </w:rPr>
+              <w:t>7:</w:t>
             </w:r>
           </w:p>
           <w:p>
             <w:pPr>
               <w:pStyle w:val="SourceCode"/>
-              <w:jc w:val="right"/>
-              <w:rPr>
-                <w:rStyle w:val="VerbatimChar"/>
-              </w:rPr>
-            </w:pPr>
-            <w:r>
-              <w:rPr>
-                <w:rStyle w:val="VerbatimChar"/>
-              </w:rPr>
-              <w:t>7:</w:t>
-            </w:r>
+              <w:rPr>
+                <w:rStyle w:val="VerbatimChar"/>
+              </w:rPr>
+            </w:pPr>
           </w:p>
           <w:p>
             <w:pPr>
               <w:pStyle w:val="SourceCode"/>
-              <w:jc w:val="right"/>
               <w:rPr>
                 <w:rStyle w:val="VerbatimChar"/>
               </w:rPr>
@@ -1154,31 +1171,28 @@
           <w:p>
             <w:pPr>
               <w:pStyle w:val="SourceCode"/>
-              <w:jc w:val="right"/>
-              <w:rPr>
-                <w:rStyle w:val="VerbatimChar"/>
-              </w:rPr>
-            </w:pPr>
+              <w:rPr>
+                <w:rStyle w:val="VerbatimChar"/>
+              </w:rPr>
+            </w:pPr>
+            <w:r>
+              <w:rPr>
+                <w:rStyle w:val="VerbatimChar"/>
+              </w:rPr>
+              <w:t>9:</w:t>
+            </w:r>
           </w:p>
           <w:p>
             <w:pPr>
               <w:pStyle w:val="SourceCode"/>
-              <w:jc w:val="right"/>
-              <w:rPr>
-                <w:rStyle w:val="VerbatimChar"/>
-              </w:rPr>
-            </w:pPr>
-            <w:r>
-              <w:rPr>
-                <w:rStyle w:val="VerbatimChar"/>
-              </w:rPr>
-              <w:t>9:</w:t>
-            </w:r>
+              <w:rPr>
+                <w:rStyle w:val="VerbatimChar"/>
+              </w:rPr>
+            </w:pPr>
           </w:p>
           <w:p>
             <w:pPr>
               <w:pStyle w:val="SourceCode"/>
-              <w:jc w:val="right"/>
               <w:rPr>
                 <w:rStyle w:val="VerbatimChar"/>
               </w:rPr>
@@ -1193,7 +1207,14 @@
           <w:p>
             <w:pPr>
               <w:pStyle w:val="SourceCode"/>
-              <w:jc w:val="right"/>
+              <w:rPr>
+                <w:rStyle w:val="VerbatimChar"/>
+              </w:rPr>
+            </w:pPr>
+          </w:p>
+          <w:p>
+            <w:pPr>
+              <w:pStyle w:val="SourceCode"/>
               <w:rPr>
                 <w:rStyle w:val="VerbatimChar"/>
               </w:rPr>
@@ -1208,31 +1229,36 @@
           <w:p>
             <w:pPr>
               <w:pStyle w:val="SourceCode"/>
-              <w:jc w:val="right"/>
-              <w:rPr>
-                <w:rStyle w:val="VerbatimChar"/>
-              </w:rPr>
-            </w:pPr>
+              <w:rPr>
+                <w:rStyle w:val="VerbatimChar"/>
+              </w:rPr>
+            </w:pPr>
+            <w:r>
+              <w:rPr>
+                <w:rStyle w:val="VerbatimChar"/>
+              </w:rPr>
+              <w:t>12:</w:t>
+            </w:r>
           </w:p>
           <w:p>
             <w:pPr>
               <w:pStyle w:val="SourceCode"/>
-              <w:jc w:val="right"/>
-              <w:rPr>
-                <w:rStyle w:val="VerbatimChar"/>
-              </w:rPr>
-            </w:pPr>
-            <w:r>
-              <w:rPr>
-                <w:rStyle w:val="VerbatimChar"/>
-              </w:rPr>
-              <w:t>12:</w:t>
-            </w:r>
+              <w:rPr>
+                <w:rStyle w:val="VerbatimChar"/>
+              </w:rPr>
+            </w:pPr>
           </w:p>
           <w:p>
             <w:pPr>
               <w:pStyle w:val="SourceCode"/>
-              <w:jc w:val="right"/>
+              <w:rPr>
+                <w:rStyle w:val="VerbatimChar"/>
+              </w:rPr>
+            </w:pPr>
+          </w:p>
+          <w:p>
+            <w:pPr>
+              <w:pStyle w:val="SourceCode"/>
               <w:rPr>
                 <w:rStyle w:val="VerbatimChar"/>
               </w:rPr>
@@ -1247,7 +1273,6 @@
           <w:p>
             <w:pPr>
               <w:pStyle w:val="SourceCode"/>
-              <w:jc w:val="right"/>
               <w:rPr>
                 <w:rStyle w:val="VerbatimChar"/>
               </w:rPr>
@@ -1256,7 +1281,6 @@
           <w:p>
             <w:pPr>
               <w:pStyle w:val="SourceCode"/>
-              <w:jc w:val="right"/>
               <w:rPr>
                 <w:rStyle w:val="VerbatimChar"/>
               </w:rPr>
@@ -1271,61 +1295,64 @@
           <w:p>
             <w:pPr>
               <w:pStyle w:val="SourceCode"/>
-              <w:jc w:val="right"/>
-              <w:rPr>
-                <w:rStyle w:val="VerbatimChar"/>
-              </w:rPr>
-            </w:pPr>
+              <w:rPr>
+                <w:rStyle w:val="VerbatimChar"/>
+              </w:rPr>
+            </w:pPr>
+            <w:r>
+              <w:rPr>
+                <w:rStyle w:val="VerbatimChar"/>
+              </w:rPr>
+              <w:t>15:</w:t>
+            </w:r>
           </w:p>
           <w:p>
             <w:pPr>
               <w:pStyle w:val="SourceCode"/>
-              <w:jc w:val="right"/>
-              <w:rPr>
-                <w:rStyle w:val="VerbatimChar"/>
-              </w:rPr>
-            </w:pPr>
-            <w:r>
-              <w:rPr>
-                <w:rStyle w:val="VerbatimChar"/>
-              </w:rPr>
-              <w:t>15:</w:t>
+              <w:rPr>
+                <w:rStyle w:val="VerbatimChar"/>
+              </w:rPr>
+            </w:pPr>
+            <w:r>
+              <w:rPr>
+                <w:rStyle w:val="VerbatimChar"/>
+              </w:rPr>
+              <w:t>16:</w:t>
             </w:r>
           </w:p>
           <w:p>
             <w:pPr>
               <w:pStyle w:val="SourceCode"/>
-              <w:jc w:val="right"/>
-              <w:rPr>
-                <w:rStyle w:val="VerbatimChar"/>
-              </w:rPr>
-            </w:pPr>
-            <w:r>
-              <w:rPr>
-                <w:rStyle w:val="VerbatimChar"/>
-              </w:rPr>
-              <w:t>16:</w:t>
+              <w:rPr>
+                <w:rStyle w:val="VerbatimChar"/>
+              </w:rPr>
+            </w:pPr>
+            <w:r>
+              <w:rPr>
+                <w:rStyle w:val="VerbatimChar"/>
+              </w:rPr>
+              <w:t>17:</w:t>
             </w:r>
           </w:p>
           <w:p>
             <w:pPr>
               <w:pStyle w:val="SourceCode"/>
-              <w:jc w:val="right"/>
-              <w:rPr>
-                <w:rStyle w:val="VerbatimChar"/>
-              </w:rPr>
-            </w:pPr>
-            <w:r>
-              <w:rPr>
-                <w:rStyle w:val="VerbatimChar"/>
-              </w:rPr>
-              <w:t>17:</w:t>
-            </w:r>
+              <w:rPr>
+                <w:rStyle w:val="VerbatimChar"/>
+              </w:rPr>
+            </w:pPr>
           </w:p>
           <w:p>
             <w:pPr>
               <w:pStyle w:val="SourceCode"/>
-              <w:jc w:val="right"/>
+              <w:rPr>
+                <w:rStyle w:val="VerbatimChar"/>
+              </w:rPr>
+            </w:pPr>
+          </w:p>
+          <w:p>
+            <w:pPr>
+              <w:pStyle w:val="SourceCode"/>
               <w:rPr>
                 <w:rStyle w:val="VerbatimChar"/>
               </w:rPr>
@@ -1340,7 +1367,6 @@
           <w:p>
             <w:pPr>
               <w:pStyle w:val="SourceCode"/>
-              <w:jc w:val="right"/>
               <w:rPr>
                 <w:rStyle w:val="VerbatimChar"/>
               </w:rPr>
@@ -1349,7 +1375,6 @@
           <w:p>
             <w:pPr>
               <w:pStyle w:val="SourceCode"/>
-              <w:jc w:val="right"/>
               <w:rPr>
                 <w:rStyle w:val="VerbatimChar"/>
               </w:rPr>
@@ -1364,31 +1389,28 @@
           <w:p>
             <w:pPr>
               <w:pStyle w:val="SourceCode"/>
-              <w:jc w:val="right"/>
-              <w:rPr>
-                <w:rStyle w:val="VerbatimChar"/>
-              </w:rPr>
-            </w:pPr>
+              <w:rPr>
+                <w:rStyle w:val="VerbatimChar"/>
+              </w:rPr>
+            </w:pPr>
+            <w:r>
+              <w:rPr>
+                <w:rStyle w:val="VerbatimChar"/>
+              </w:rPr>
+              <w:t>20:</w:t>
+            </w:r>
           </w:p>
           <w:p>
             <w:pPr>
               <w:pStyle w:val="SourceCode"/>
-              <w:jc w:val="right"/>
-              <w:rPr>
-                <w:rStyle w:val="VerbatimChar"/>
-              </w:rPr>
-            </w:pPr>
-            <w:r>
-              <w:rPr>
-                <w:rStyle w:val="VerbatimChar"/>
-              </w:rPr>
-              <w:t>20:</w:t>
-            </w:r>
+              <w:rPr>
+                <w:rStyle w:val="VerbatimChar"/>
+              </w:rPr>
+            </w:pPr>
           </w:p>
           <w:p>
             <w:pPr>
               <w:pStyle w:val="SourceCode"/>
-              <w:jc w:val="right"/>
               <w:rPr>
                 <w:rStyle w:val="VerbatimChar"/>
               </w:rPr>
@@ -1403,31 +1425,28 @@
           <w:p>
             <w:pPr>
               <w:pStyle w:val="SourceCode"/>
-              <w:jc w:val="right"/>
-              <w:rPr>
-                <w:rStyle w:val="VerbatimChar"/>
-              </w:rPr>
-            </w:pPr>
+              <w:rPr>
+                <w:rStyle w:val="VerbatimChar"/>
+              </w:rPr>
+            </w:pPr>
+            <w:r>
+              <w:rPr>
+                <w:rStyle w:val="VerbatimChar"/>
+              </w:rPr>
+              <w:t>22:</w:t>
+            </w:r>
           </w:p>
           <w:p>
             <w:pPr>
               <w:pStyle w:val="SourceCode"/>
-              <w:jc w:val="right"/>
-              <w:rPr>
-                <w:rStyle w:val="VerbatimChar"/>
-              </w:rPr>
-            </w:pPr>
-            <w:r>
-              <w:rPr>
-                <w:rStyle w:val="VerbatimChar"/>
-              </w:rPr>
-              <w:t>22:</w:t>
-            </w:r>
+              <w:rPr>
+                <w:rStyle w:val="VerbatimChar"/>
+              </w:rPr>
+            </w:pPr>
           </w:p>
           <w:p>
             <w:pPr>
               <w:pStyle w:val="SourceCode"/>
-              <w:jc w:val="right"/>
               <w:rPr>
                 <w:rStyle w:val="VerbatimChar"/>
               </w:rPr>
@@ -1442,16 +1461,20 @@
           <w:p>
             <w:pPr>
               <w:pStyle w:val="SourceCode"/>
-              <w:jc w:val="right"/>
-              <w:rPr>
-                <w:rStyle w:val="VerbatimChar"/>
-              </w:rPr>
-            </w:pPr>
+              <w:rPr>
+                <w:rStyle w:val="VerbatimChar"/>
+              </w:rPr>
+            </w:pPr>
+            <w:r>
+              <w:rPr>
+                <w:rStyle w:val="VerbatimChar"/>
+              </w:rPr>
+              <w:t>24:</w:t>
+            </w:r>
           </w:p>
           <w:p>
             <w:pPr>
               <w:pStyle w:val="SourceCode"/>
-              <w:jc w:val="right"/>
               <w:rPr>
                 <w:rStyle w:val="VerbatimChar"/>
               </w:rPr>
@@ -1460,89 +1483,50 @@
           <w:p>
             <w:pPr>
               <w:pStyle w:val="SourceCode"/>
-              <w:jc w:val="right"/>
-              <w:rPr>
-                <w:rStyle w:val="VerbatimChar"/>
-              </w:rPr>
-            </w:pPr>
-            <w:r>
-              <w:rPr>
-                <w:rStyle w:val="VerbatimChar"/>
-              </w:rPr>
-              <w:t>24:</w:t>
+              <w:rPr>
+                <w:rStyle w:val="VerbatimChar"/>
+              </w:rPr>
+            </w:pPr>
+            <w:r>
+              <w:rPr>
+                <w:rStyle w:val="VerbatimChar"/>
+              </w:rPr>
+              <w:t>25:26:</w:t>
             </w:r>
           </w:p>
           <w:p>
             <w:pPr>
               <w:pStyle w:val="SourceCode"/>
-              <w:jc w:val="right"/>
-              <w:rPr>
-                <w:rStyle w:val="VerbatimChar"/>
-              </w:rPr>
-            </w:pPr>
-            <w:r>
-              <w:rPr>
-                <w:rStyle w:val="VerbatimChar"/>
-              </w:rPr>
-              <w:t>25:</w:t>
-            </w:r>
+              <w:rPr>
+                <w:rStyle w:val="VerbatimChar"/>
+              </w:rPr>
+            </w:pPr>
           </w:p>
           <w:p>
             <w:pPr>
               <w:pStyle w:val="SourceCode"/>
-              <w:jc w:val="right"/>
-              <w:rPr>
-                <w:rStyle w:val="VerbatimChar"/>
-              </w:rPr>
-            </w:pPr>
-            <w:r>
-              <w:rPr>
-                <w:rStyle w:val="VerbatimChar"/>
-              </w:rPr>
-              <w:t>26:</w:t>
-            </w:r>
+              <w:rPr>
+                <w:rStyle w:val="VerbatimChar"/>
+              </w:rPr>
+            </w:pPr>
           </w:p>
           <w:p>
             <w:pPr>
               <w:pStyle w:val="SourceCode"/>
-              <w:jc w:val="right"/>
-              <w:rPr>
-                <w:rStyle w:val="VerbatimChar"/>
-              </w:rPr>
-            </w:pPr>
-            <w:r>
-              <w:rPr>
-                <w:rStyle w:val="VerbatimChar"/>
-              </w:rPr>
-              <w:t>27:</w:t>
-            </w:r>
-          </w:p>
-        </w:tc>
-        <w:tc>
-          <w:tcPr>
-            <w:tcW w:w="9900" w:type="dxa"/>
+              <w:rPr>
+                <w:rStyle w:val="VerbatimChar"/>
+              </w:rPr>
+            </w:pPr>
+          </w:p>
+        </w:tc>
+        <w:tc>
+          <w:tcPr>
+            <w:tcW w:w="4662" w:type="pct"/>
+            <w:gridSpan w:val="2"/>
           </w:tcPr>
           <w:p>
             <w:pPr>
               <w:pStyle w:val="SourceCode"/>
-              <w:rPr>
-                <w:rStyle w:val="VerbatimChar"/>
-              </w:rPr>
-            </w:pPr>
-            <w:r>
-              <w:rPr>
-                <w:rStyle w:val="VerbatimChar"/>
-              </w:rPr>
-              <w:lastRenderedPageBreak/>
-              <w:t>Start</w:t>
-            </w:r>
-          </w:p>
-          <w:p>
-            <w:pPr>
-              <w:pStyle w:val="SourceCode"/>
-              <w:rPr>
-                <w:rStyle w:val="VerbatimChar"/>
-              </w:rPr>
             </w:pPr>
             <w:r>
               <w:rPr>
@@ -1580,11 +1564,9 @@
             <w:r>
               <w:br/>
             </w:r>
-          </w:p>
-          <w:p>
-            <w:pPr>
-              <w:pStyle w:val="SourceCode"/>
-            </w:pPr>
+            <w:r>
+              <w:br/>
+            </w:r>
             <w:r>
               <w:rPr>
                 <w:rStyle w:val="VerbatimChar"/>
@@ -1598,7 +1580,21 @@
               <w:rPr>
                 <w:rStyle w:val="VerbatimChar"/>
               </w:rPr>
-              <w:t xml:space="preserve">    Reset WebSecurityGym Environment</w:t>
+              <w:t xml:space="preserve">    Reset </w:t>
+            </w:r>
+            <w:proofErr w:type="spellStart"/>
+            <w:r>
+              <w:rPr>
+                <w:rStyle w:val="VerbatimChar"/>
+              </w:rPr>
+              <w:t>WebSecurityGym</w:t>
+            </w:r>
+            <w:proofErr w:type="spellEnd"/>
+            <w:r>
+              <w:rPr>
+                <w:rStyle w:val="VerbatimChar"/>
+              </w:rPr>
+              <w:t xml:space="preserve"> Environment</w:t>
             </w:r>
             <w:r>
               <w:br/>
@@ -1628,7 +1624,21 @@
               <w:rPr>
                 <w:rStyle w:val="VerbatimChar"/>
               </w:rPr>
-              <w:t xml:space="preserve">        With probability ε, select random action a_t from allowed Phase actions</w:t>
+              <w:t xml:space="preserve">        With probability ε, select random action </w:t>
+            </w:r>
+            <w:proofErr w:type="spellStart"/>
+            <w:r>
+              <w:rPr>
+                <w:rStyle w:val="VerbatimChar"/>
+              </w:rPr>
+              <w:t>a_t</w:t>
+            </w:r>
+            <w:proofErr w:type="spellEnd"/>
+            <w:r>
+              <w:rPr>
+                <w:rStyle w:val="VerbatimChar"/>
+              </w:rPr>
+              <w:t xml:space="preserve"> from allowed Phase actions</w:t>
             </w:r>
             <w:r>
               <w:br/>
@@ -1637,7 +1647,49 @@
               <w:rPr>
                 <w:rStyle w:val="VerbatimChar"/>
               </w:rPr>
-              <w:t xml:space="preserve">        Otherwise, select a_t = argmax_a Q(s_t, a; θ)</w:t>
+              <w:t xml:space="preserve">        Otherwise, select </w:t>
+            </w:r>
+            <w:proofErr w:type="spellStart"/>
+            <w:r>
+              <w:rPr>
+                <w:rStyle w:val="VerbatimChar"/>
+              </w:rPr>
+              <w:t>a_t</w:t>
+            </w:r>
+            <w:proofErr w:type="spellEnd"/>
+            <w:r>
+              <w:rPr>
+                <w:rStyle w:val="VerbatimChar"/>
+              </w:rPr>
+              <w:t xml:space="preserve"> = </w:t>
+            </w:r>
+            <w:proofErr w:type="spellStart"/>
+            <w:r>
+              <w:rPr>
+                <w:rStyle w:val="VerbatimChar"/>
+              </w:rPr>
+              <w:t>argmax_a</w:t>
+            </w:r>
+            <w:proofErr w:type="spellEnd"/>
+            <w:r>
+              <w:rPr>
+                <w:rStyle w:val="VerbatimChar"/>
+              </w:rPr>
+              <w:t xml:space="preserve"> Q(</w:t>
+            </w:r>
+            <w:proofErr w:type="spellStart"/>
+            <w:r>
+              <w:rPr>
+                <w:rStyle w:val="VerbatimChar"/>
+              </w:rPr>
+              <w:t>s_t</w:t>
+            </w:r>
+            <w:proofErr w:type="spellEnd"/>
+            <w:r>
+              <w:rPr>
+                <w:rStyle w:val="VerbatimChar"/>
+              </w:rPr>
+              <w:t>, a; θ)</w:t>
             </w:r>
             <w:r>
               <w:br/>
@@ -1649,7 +1701,21 @@
               <w:rPr>
                 <w:rStyle w:val="VerbatimChar"/>
               </w:rPr>
-              <w:t xml:space="preserve">        Execute payload/action a_t against target endpoints</w:t>
+              <w:t xml:space="preserve">        Execute payload/action </w:t>
+            </w:r>
+            <w:proofErr w:type="spellStart"/>
+            <w:r>
+              <w:rPr>
+                <w:rStyle w:val="VerbatimChar"/>
+              </w:rPr>
+              <w:t>a_t</w:t>
+            </w:r>
+            <w:proofErr w:type="spellEnd"/>
+            <w:r>
+              <w:rPr>
+                <w:rStyle w:val="VerbatimChar"/>
+              </w:rPr>
+              <w:t xml:space="preserve"> against target endpoints</w:t>
             </w:r>
             <w:r>
               <w:br/>
@@ -1658,7 +1724,35 @@
               <w:rPr>
                 <w:rStyle w:val="VerbatimChar"/>
               </w:rPr>
-              <w:t xml:space="preserve">        Observe reward r_t, parsed numerical next state s_{t+1}, and done signal</w:t>
+              <w:t xml:space="preserve">        Observe reward </w:t>
+            </w:r>
+            <w:proofErr w:type="spellStart"/>
+            <w:r>
+              <w:rPr>
+                <w:rStyle w:val="VerbatimChar"/>
+              </w:rPr>
+              <w:t>r_t</w:t>
+            </w:r>
+            <w:proofErr w:type="spellEnd"/>
+            <w:r>
+              <w:rPr>
+                <w:rStyle w:val="VerbatimChar"/>
+              </w:rPr>
+              <w:t xml:space="preserve">, parsed numerical next </w:t>
+            </w:r>
+            <w:proofErr w:type="spellStart"/>
+            <w:r>
+              <w:rPr>
+                <w:rStyle w:val="VerbatimChar"/>
+              </w:rPr>
+              <w:t>state s</w:t>
+            </w:r>
+            <w:proofErr w:type="spellEnd"/>
+            <w:r>
+              <w:rPr>
+                <w:rStyle w:val="VerbatimChar"/>
+              </w:rPr>
+              <w:t>_{t+1}, and done signal</w:t>
             </w:r>
             <w:r>
               <w:br/>
@@ -1670,7 +1764,49 @@
               <w:rPr>
                 <w:rStyle w:val="VerbatimChar"/>
               </w:rPr>
-              <w:t xml:space="preserve">        Store transition (s_t, a_t, r_t, s_{t+1}) in replay buffer D</w:t>
+              <w:t xml:space="preserve">        Store transition (</w:t>
+            </w:r>
+            <w:proofErr w:type="spellStart"/>
+            <w:r>
+              <w:rPr>
+                <w:rStyle w:val="VerbatimChar"/>
+              </w:rPr>
+              <w:t>s_t</w:t>
+            </w:r>
+            <w:proofErr w:type="spellEnd"/>
+            <w:r>
+              <w:rPr>
+                <w:rStyle w:val="VerbatimChar"/>
+              </w:rPr>
+              <w:t xml:space="preserve">, </w:t>
+            </w:r>
+            <w:proofErr w:type="spellStart"/>
+            <w:r>
+              <w:rPr>
+                <w:rStyle w:val="VerbatimChar"/>
+              </w:rPr>
+              <w:t>a_t</w:t>
+            </w:r>
+            <w:proofErr w:type="spellEnd"/>
+            <w:r>
+              <w:rPr>
+                <w:rStyle w:val="VerbatimChar"/>
+              </w:rPr>
+              <w:t xml:space="preserve">, </w:t>
+            </w:r>
+            <w:proofErr w:type="spellStart"/>
+            <w:r>
+              <w:rPr>
+                <w:rStyle w:val="VerbatimChar"/>
+              </w:rPr>
+              <w:t>r_t</w:t>
+            </w:r>
+            <w:proofErr w:type="spellEnd"/>
+            <w:r>
+              <w:rPr>
+                <w:rStyle w:val="VerbatimChar"/>
+              </w:rPr>
+              <w:t>, s_{t+1}) in replay buffer D</w:t>
             </w:r>
             <w:r>
               <w:br/>
@@ -1682,7 +1818,35 @@
               <w:rPr>
                 <w:rStyle w:val="VerbatimChar"/>
               </w:rPr>
-              <w:t xml:space="preserve">        If len(D) &gt; batch_size:</w:t>
+              <w:t xml:space="preserve">        If </w:t>
+            </w:r>
+            <w:proofErr w:type="spellStart"/>
+            <w:r>
+              <w:rPr>
+                <w:rStyle w:val="VerbatimChar"/>
+              </w:rPr>
+              <w:t>len</w:t>
+            </w:r>
+            <w:proofErr w:type="spellEnd"/>
+            <w:r>
+              <w:rPr>
+                <w:rStyle w:val="VerbatimChar"/>
+              </w:rPr>
+              <w:t xml:space="preserve">(D) &gt; </w:t>
+            </w:r>
+            <w:proofErr w:type="spellStart"/>
+            <w:r>
+              <w:rPr>
+                <w:rStyle w:val="VerbatimChar"/>
+              </w:rPr>
+              <w:t>batch_size</w:t>
+            </w:r>
+            <w:proofErr w:type="spellEnd"/>
+            <w:r>
+              <w:rPr>
+                <w:rStyle w:val="VerbatimChar"/>
+              </w:rPr>
+              <w:t>:</w:t>
             </w:r>
             <w:r>
               <w:br/>
@@ -1754,7 +1918,21 @@
               <w:rPr>
                 <w:rStyle w:val="VerbatimChar"/>
               </w:rPr>
-              <w:t xml:space="preserve">        s_t = s_{t+1}</w:t>
+              <w:t xml:space="preserve">        </w:t>
+            </w:r>
+            <w:proofErr w:type="spellStart"/>
+            <w:r>
+              <w:rPr>
+                <w:rStyle w:val="VerbatimChar"/>
+              </w:rPr>
+              <w:t>s_t</w:t>
+            </w:r>
+            <w:proofErr w:type="spellEnd"/>
+            <w:r>
+              <w:rPr>
+                <w:rStyle w:val="VerbatimChar"/>
+              </w:rPr>
+              <w:t xml:space="preserve"> = s_{t+1}</w:t>
             </w:r>
             <w:r>
               <w:br/>
@@ -1775,7 +1953,21 @@
               <w:rPr>
                 <w:rStyle w:val="VerbatimChar"/>
               </w:rPr>
-              <w:t xml:space="preserve">    If agent regularly achieves high cumulative_reward:</w:t>
+              <w:t xml:space="preserve">    If agent regularly achieves high </w:t>
+            </w:r>
+            <w:proofErr w:type="spellStart"/>
+            <w:r>
+              <w:rPr>
+                <w:rStyle w:val="VerbatimChar"/>
+              </w:rPr>
+              <w:t>cumulative_reward</w:t>
+            </w:r>
+            <w:proofErr w:type="spellEnd"/>
+            <w:r>
+              <w:rPr>
+                <w:rStyle w:val="VerbatimChar"/>
+              </w:rPr>
+              <w:t>:</w:t>
             </w:r>
             <w:r>
               <w:br/>
@@ -1793,7 +1985,35 @@
               <w:rPr>
                 <w:rStyle w:val="VerbatimChar"/>
               </w:rPr>
-              <w:t xml:space="preserve">        Phase = update_curriculum_phase(cumulative_reward)</w:t>
+              <w:t xml:space="preserve">        Phase = </w:t>
+            </w:r>
+            <w:proofErr w:type="spellStart"/>
+            <w:r>
+              <w:rPr>
+                <w:rStyle w:val="VerbatimChar"/>
+              </w:rPr>
+              <w:t>update_curriculum_phase</w:t>
+            </w:r>
+            <w:proofErr w:type="spellEnd"/>
+            <w:r>
+              <w:rPr>
+                <w:rStyle w:val="VerbatimChar"/>
+              </w:rPr>
+              <w:t>(</w:t>
+            </w:r>
+            <w:proofErr w:type="spellStart"/>
+            <w:r>
+              <w:rPr>
+                <w:rStyle w:val="VerbatimChar"/>
+              </w:rPr>
+              <w:t>cumulative_reward</w:t>
+            </w:r>
+            <w:proofErr w:type="spellEnd"/>
+            <w:r>
+              <w:rPr>
+                <w:rStyle w:val="VerbatimChar"/>
+              </w:rPr>
+              <w:t>)</w:t>
             </w:r>
             <w:r>
               <w:br/>
@@ -1810,8 +2030,7 @@
     </w:tbl>
     <w:p>
       <w:r>
-        <w:lastRenderedPageBreak/>
-        <w:pict w14:anchorId="45FE90D6">
+        <w:pict w14:anchorId="05321CCE">
           <v:rect id="_x0000_i1028" style="width:0;height:1.5pt" o:hralign="center" o:hrstd="t" o:hr="t"/>
         </w:pict>
       </w:r>
@@ -1825,6 +2044,7 @@
       <w:bookmarkEnd w:id="12"/>
       <w:bookmarkEnd w:id="14"/>
       <w:r>
+        <w:lastRenderedPageBreak/>
         <w:t>IV. EVALUATION AND RESULTS</w:t>
       </w:r>
     </w:p>
@@ -1873,7 +2093,6 @@
               <w:pStyle w:val="Compact"/>
             </w:pPr>
             <w:r>
-              <w:lastRenderedPageBreak/>
               <w:t>Website</w:t>
             </w:r>
           </w:p>
@@ -3036,6 +3255,7 @@
               <w:pStyle w:val="Compact"/>
             </w:pPr>
             <w:r>
+              <w:lastRenderedPageBreak/>
               <w:t>Social Media (5003)</w:t>
             </w:r>
           </w:p>
@@ -3451,11 +3671,7 @@
               <w:pStyle w:val="Compact"/>
             </w:pPr>
             <w:r>
-              <w:t xml:space="preserve">Banking </w:t>
-            </w:r>
-            <w:r>
-              <w:lastRenderedPageBreak/>
-              <w:t>(5004)</w:t>
+              <w:t>Banking (5004)</w:t>
             </w:r>
           </w:p>
         </w:tc>
@@ -3468,12 +3684,7 @@
               <w:pStyle w:val="Compact"/>
             </w:pPr>
             <w:r>
-              <w:lastRenderedPageBreak/>
-              <w:t xml:space="preserve">Insecure Direct Object </w:t>
-            </w:r>
-            <w:r>
-              <w:lastRenderedPageBreak/>
-              <w:t>Reference (IDOR)</w:t>
+              <w:t>Insecure Direct Object Reference (IDOR)</w:t>
             </w:r>
           </w:p>
         </w:tc>
@@ -3487,7 +3698,6 @@
               <w:jc w:val="right"/>
             </w:pPr>
             <w:r>
-              <w:lastRenderedPageBreak/>
               <w:t>2</w:t>
             </w:r>
           </w:p>
@@ -3529,11 +3739,7 @@
               <w:pStyle w:val="Compact"/>
             </w:pPr>
             <w:r>
-              <w:t>Med</w:t>
-            </w:r>
-            <w:r>
-              <w:lastRenderedPageBreak/>
-              <w:t>ium</w:t>
+              <w:t>Medium</w:t>
             </w:r>
           </w:p>
         </w:tc>
@@ -3548,7 +3754,6 @@
               <w:pStyle w:val="Compact"/>
             </w:pPr>
             <w:r>
-              <w:lastRenderedPageBreak/>
               <w:t>Banking (5004)</w:t>
             </w:r>
           </w:p>
@@ -3978,6 +4183,7 @@
       <w:bookmarkStart w:id="16" w:name="v.-discussion"/>
       <w:bookmarkEnd w:id="15"/>
       <w:r>
+        <w:lastRenderedPageBreak/>
         <w:t>V. DISCUSSION</w:t>
       </w:r>
     </w:p>
@@ -4054,9 +4260,8 @@
         <w:rPr>
           <w:noProof/>
         </w:rPr>
-        <w:lastRenderedPageBreak/>
         <w:drawing>
-          <wp:inline distT="0" distB="0" distL="0" distR="0" wp14:anchorId="52073968" wp14:editId="7A32388C">
+          <wp:inline distT="0" distB="0" distL="0" distR="0" wp14:anchorId="6E87BA43" wp14:editId="68019BB7">
             <wp:extent cx="5334000" cy="2632876"/>
             <wp:effectExtent l="0" t="0" r="0" b="0"/>
             <wp:docPr id="29" name="Picture" descr="Agent Training Progression"/>
@@ -4129,12 +4334,16 @@
         <w:pStyle w:val="FirstParagraph"/>
       </w:pPr>
       <w:r>
-        <w:t>While the agent demonstrates significant efficacy in discovering injection flaws and state-based vulnerabilities, several limitations remain. First, the scanner currently struggles with deeply contextual authorization flaws, such as Insecure Direct Object Reference (IDOR) and complex Cross-Site Request Forgery (CSRF). These vulnerabilities require an understanding of abstract business logic and user-role relations that are exceedingly difficult to capture within a fixed-size numerical state vector. Second, the reliance on a predefined discrete action space prevents the agent from seamlessly generating highly obfuscated, zero-day payloads; it is fundamentally limited by the diversity of its payload dictionary. Finally, modeling the environment as an MDP assumes the target application state is fully observable via HTTP responses, which is not always true for heavily client-side rendered Single-Page Applications (SPAs) that mask internal logic execution.</w:t>
-      </w:r>
-    </w:p>
-    <w:p>
-      <w:r>
-        <w:pict w14:anchorId="73B05708">
+        <w:t xml:space="preserve">While the agent demonstrates significant efficacy in discovering injection flaws and state-based vulnerabilities, several limitations remain. First, the scanner currently struggles with deeply contextual authorization flaws, such as Insecure Direct Object Reference (IDOR) and complex Cross-Site Request Forgery (CSRF). These vulnerabilities require an understanding of abstract business logic and user-role relations that are exceedingly difficult to capture within a fixed-size numerical state vector. Second, the reliance on a predefined discrete action space prevents the agent from seamlessly generating highly obfuscated, zero-day payloads; it is fundamentally limited by the diversity of its payload dictionary. Finally, modeling the environment as an MDP assumes the target application </w:t>
+      </w:r>
+      <w:r>
+        <w:lastRenderedPageBreak/>
+        <w:t>state is fully observable via HTTP responses, which is not always true for heavily client-side rendered Single-Page Applications (SPAs) that mask internal logic execution.</w:t>
+      </w:r>
+    </w:p>
+    <w:p>
+      <w:r>
+        <w:pict w14:anchorId="20BFB398">
           <v:rect id="_x0000_i1029" style="width:0;height:1.5pt" o:hralign="center" o:hrstd="t" o:hr="t"/>
         </w:pict>
       </w:r>
@@ -4164,11 +4373,7 @@
         <w:t>WebSecurityGym</w:t>
       </w:r>
       <w:r>
-        <w:t xml:space="preserve"> environment, we demonstrated that Reinforcement Learning can effectively replicate and scale the cognitive processes of human penetration testers. The implementation of Phase-Based Learning successfully guided the agent through the Cyber </w:t>
-      </w:r>
-      <w:r>
-        <w:lastRenderedPageBreak/>
-        <w:t>Kill Chain, transitioning from reconnaissance to the execution of complex exploit chains like Cross-Site Scripting (XSS) and SQL Injection (SQLi) autonomously.</w:t>
+        <w:t xml:space="preserve"> environment, we demonstrated that Reinforcement Learning can effectively replicate and scale the cognitive processes of human penetration testers. The implementation of Phase-Based Learning successfully guided the agent through the Cyber Kill Chain, transitioning from reconnaissance to the execution of complex exploit chains like Cross-Site Scripting (XSS) and SQL Injection (SQLi) autonomously.</w:t>
       </w:r>
     </w:p>
     <w:p>
@@ -4189,7 +4394,7 @@
     </w:p>
     <w:p>
       <w:r>
-        <w:pict w14:anchorId="4F07B7A1">
+        <w:pict w14:anchorId="75598836">
           <v:rect id="_x0000_i1030" style="width:0;height:1.5pt" o:hralign="center" o:hrstd="t" o:hr="t"/>
         </w:pict>
       </w:r>
@@ -4209,7 +4414,11 @@
         <w:pStyle w:val="FirstParagraph"/>
       </w:pPr>
       <w:r>
-        <w:t>[1] R. Singh, S. M. Patil, M. K. Gupta, and D. R. Patil, “Analysis of Web Application Vulnerabilities using Dynamic Application Security Testing.” [2] R. Sri Devi and M. Mohan Kumar, “Testing for Security Weakness of Web Applications using Ethical Hacking.” [3] C. Mainka, J. Somorovsky, and J. Schwenk, “Penetration Testing Tool for Web Services Security,” Ruhr University Bochum, Germany. [4] P. Haritha, G. S. Prasad, K. Niharika, V. Charishma, and K. B. Sai, “Network Intrusion Detection using Deep Reinforcement Learning.” [5] V. Mnih et al., “Human-level control through deep reinforcement learning,” Nature, vol. 518, pp. 529-533, 2015. [6] T. Schaul, J. Quan, I. Antonoglou, and D. Silver, “Prioritized Experience Replay,” Google DeepMind, ICLR 2016. [7] M. C. Ghanem and T. M. Chen, “Reinforcement learning for intelligent automated penetration testing,” 2020. [8] Anonymous, “Pentest-R1: Towards Autonomous Penetration Testing Reasoning Optimized via Two-Stage Reinforcement Learning,” arXiv, 2024. [9] H. A. Shaikh et al., “Reinforcement Learning-Enforced Penetration Testing for SoC Security Verification,” IEEE Transactions on Very Large Scale Integration (VLSI) Systems, 2024. [10] S. Zhou et al., “SCRIPT: A Scalable Continual Reinforcement Learning Framework for Autonomous Penetration Testing,” Expert Systems With Applications. [11] J. Liu et al., “Autonomous penetration testing using reinforcement learning: A review and perspectives,” Expert Systems With Applications. [12] N. Singh, V. Meherhomji, and B. R. Chandavarkar, “Automated versus Manual Approach of Web Application Penetration Testing,” National Institute of Technology Karnataka. [13] D. Kao, Y. Chen, and F. Tsai, “Hacking Tool Identification in Penetration Testing,” Central Police University. [14] A. Chowdhary et al., “Autonomous Security Analysis and Penetration Testing,” Arizona State University.</w:t>
+        <w:t xml:space="preserve">[1] R. Singh, S. M. Patil, M. K. Gupta, and D. R. Patil, “Analysis of Web Application Vulnerabilities using Dynamic Application Security Testing.” [2] R. Sri Devi and M. Mohan Kumar, “Testing for Security Weakness of Web Applications using Ethical Hacking.” [3] C. Mainka, J. Somorovsky, and J. Schwenk, “Penetration Testing Tool for Web Services Security,” Ruhr University Bochum, Germany. [4] P. Haritha, G. S. Prasad, K. Niharika, V. Charishma, and K. B. Sai, “Network Intrusion Detection using Deep Reinforcement Learning.” [5] V. Mnih et al., “Human-level control through deep reinforcement learning,” Nature, vol. 518, pp. 529-533, 2015. [6] T. Schaul, J. Quan, I. Antonoglou, and D. Silver, “Prioritized Experience Replay,” Google DeepMind, ICLR 2016. [7] M. C. Ghanem and T. M. Chen, “Reinforcement learning for intelligent automated penetration testing,” 2020. [8] </w:t>
+      </w:r>
+      <w:r>
+        <w:lastRenderedPageBreak/>
+        <w:t>Anonymous, “Pentest-R1: Towards Autonomous Penetration Testing Reasoning Optimized via Two-Stage Reinforcement Learning,” arXiv, 2024. [9] H. A. Shaikh et al., “Reinforcement Learning-Enforced Penetration Testing for SoC Security Verification,” IEEE Transactions on Very Large Scale Integration (VLSI) Systems, 2024. [10] S. Zhou et al., “SCRIPT: A Scalable Continual Reinforcement Learning Framework for Autonomous Penetration Testing,” Expert Systems With Applications. [11] J. Liu et al., “Autonomous penetration testing using reinforcement learning: A review and perspectives,” Expert Systems With Applications. [12] N. Singh, V. Meherhomji, and B. R. Chandavarkar, “Automated versus Manual Approach of Web Application Penetration Testing,” National Institute of Technology Karnataka. [13] D. Kao, Y. Chen, and F. Tsai, “Hacking Tool Identification in Penetration Testing,” Central Police University. [14] A. Chowdhary et al., “Autonomous Security Analysis and Penetration Testing,” Arizona State University. [15] S. Jaganathan, M. K. Latha, and K. Dharanikota, “Design and analysis of reinforcement learning models for automated penetration testing,” IAES International Journal of Artificial Intelligence (IJ-AI), vol. 14, no. 5, pp. 4061-4073, 2025.</w:t>
       </w:r>
       <w:bookmarkEnd w:id="20"/>
     </w:p>
@@ -4230,7 +4439,7 @@
   <w:abstractNum w:abstractNumId="0" w15:restartNumberingAfterBreak="0">
     <w:nsid w:val="0000A990"/>
     <w:multiLevelType w:val="multilevel"/>
-    <w:tmpl w:val="5BD09CDA"/>
+    <w:tmpl w:val="A1AE2C96"/>
     <w:lvl w:ilvl="0">
       <w:numFmt w:val="bullet"/>
       <w:lvlText w:val=" "/>
@@ -4307,7 +4516,7 @@
   <w:abstractNum w:abstractNumId="1" w15:restartNumberingAfterBreak="0">
     <w:nsid w:val="0000A991"/>
     <w:multiLevelType w:val="multilevel"/>
-    <w:tmpl w:val="F0F48070"/>
+    <w:tmpl w:val="377A9E04"/>
     <w:lvl w:ilvl="0">
       <w:numFmt w:val="bullet"/>
       <w:lvlText w:val=""/>
@@ -4411,7 +4620,7 @@
   <w:abstractNum w:abstractNumId="2" w15:restartNumberingAfterBreak="0">
     <w:nsid w:val="00A99411"/>
     <w:multiLevelType w:val="multilevel"/>
-    <w:tmpl w:val="72BACD66"/>
+    <w:tmpl w:val="E20C9402"/>
     <w:lvl w:ilvl="0">
       <w:start w:val="1"/>
       <w:numFmt w:val="decimal"/>
@@ -4494,10 +4703,10 @@
       </w:pPr>
     </w:lvl>
   </w:abstractNum>
-  <w:num w:numId="1" w16cid:durableId="1357536448">
+  <w:num w:numId="1" w16cid:durableId="767238427">
     <w:abstractNumId w:val="0"/>
   </w:num>
-  <w:num w:numId="2" w16cid:durableId="294139932">
+  <w:num w:numId="2" w16cid:durableId="2030525737">
     <w:abstractNumId w:val="2"/>
     <w:lvlOverride w:ilvl="0">
       <w:startOverride w:val="1"/>
@@ -4527,16 +4736,16 @@
       <w:startOverride w:val="1"/>
     </w:lvlOverride>
   </w:num>
-  <w:num w:numId="3" w16cid:durableId="404499974">
+  <w:num w:numId="3" w16cid:durableId="1767573071">
     <w:abstractNumId w:val="1"/>
   </w:num>
-  <w:num w:numId="4" w16cid:durableId="881794323">
+  <w:num w:numId="4" w16cid:durableId="787745841">
     <w:abstractNumId w:val="1"/>
   </w:num>
-  <w:num w:numId="5" w16cid:durableId="582026736">
+  <w:num w:numId="5" w16cid:durableId="712117953">
     <w:abstractNumId w:val="1"/>
   </w:num>
-  <w:num w:numId="6" w16cid:durableId="528838404">
+  <w:num w:numId="6" w16cid:durableId="1047728356">
     <w:abstractNumId w:val="1"/>
   </w:num>
 </w:numbering>
@@ -5036,6 +5245,7 @@
   <w:style w:type="paragraph" w:styleId="BodyText">
     <w:name w:val="Body Text"/>
     <w:basedOn w:val="Normal"/>
+    <w:link w:val="BodyTextChar"/>
     <w:qFormat/>
     <w:pPr>
       <w:spacing w:before="180" w:after="180"/>
@@ -5751,10 +5961,16 @@
       <w:sz w:val="22"/>
     </w:rPr>
   </w:style>
+  <w:style w:type="character" w:customStyle="1" w:styleId="BodyTextChar">
+    <w:name w:val="Body Text Char"/>
+    <w:basedOn w:val="DefaultParagraphFont"/>
+    <w:link w:val="BodyText"/>
+    <w:rsid w:val="00937CBF"/>
+  </w:style>
   <w:style w:type="table" w:styleId="TableGrid">
     <w:name w:val="Table Grid"/>
     <w:basedOn w:val="TableNormal"/>
-    <w:rsid w:val="00A957A8"/>
+    <w:rsid w:val="00937CBF"/>
     <w:pPr>
       <w:spacing w:after="0"/>
     </w:pPr>

</xml_diff>

<commit_message>
feat: Add autonomous scan evaluation results, logs, and research paper drafts, updating existing evaluation scripts.
</commit_message>
<xml_diff>
--- a/research/Bachelor_Paper_Draft.docx
+++ b/research/Bachelor_Paper_Draft.docx
@@ -2053,7 +2053,7 @@
         <w:pStyle w:val="FirstParagraph"/>
       </w:pPr>
       <w:r>
-        <w:t>To comprehensively evaluate the performance of our customized RL-based autonomous scanner, we benchmarked the agent against a suite of intentionally vulnerable applications: E-Commerce, Social Media, Banking, Blog, and File Share. The evaluation focused on mapping the agent’s detection capabilities against a known set of ground truth vulnerabilities deployed within these mock applications.</w:t>
+        <w:t>To make the results more reliable, each mock website was scanned five times with autonomous_scan.py using checkpoints/improved_mock_ep10000.pth. The scanner used the mock_targets setup, so the agent worked with the reduced 50-action space prepared for these benchmark websites.</w:t>
       </w:r>
     </w:p>
     <w:p>
@@ -2061,7 +2061,7 @@
         <w:pStyle w:val="BodyText"/>
       </w:pPr>
       <w:r>
-        <w:t>Table I summarizes the agent’s detection rates grouped by the vulnerable applications and specific vulnerability classifications. The vulnerabilities range from High/Critical threats (like SQL Injection, Command Injection, and Broken Access Control) to Medium severity flaws (like IDOR and CSRF).</w:t>
+        <w:t>Table I shows the average number of unique confirmed findings from those five runs after matching the scan results with the real vulnerabilities in the source code of each target.</w:t>
       </w:r>
     </w:p>
     <w:tbl>
@@ -2089,9 +2089,6 @@
             <w:tcW w:w="1355" w:type="dxa"/>
           </w:tcPr>
           <w:p>
-            <w:pPr>
-              <w:pStyle w:val="Compact"/>
-            </w:pPr>
             <w:r>
               <w:t>Website</w:t>
             </w:r>
@@ -2102,9 +2099,6 @@
             <w:tcW w:w="2782" w:type="dxa"/>
           </w:tcPr>
           <w:p>
-            <w:pPr>
-              <w:pStyle w:val="Compact"/>
-            </w:pPr>
             <w:r>
               <w:t>Vulnerability Type</w:t>
             </w:r>
@@ -2115,10 +2109,6 @@
             <w:tcW w:w="998" w:type="dxa"/>
           </w:tcPr>
           <w:p>
-            <w:pPr>
-              <w:pStyle w:val="Compact"/>
-              <w:jc w:val="right"/>
-            </w:pPr>
             <w:r>
               <w:t>Total Existing</w:t>
             </w:r>
@@ -2129,12 +2119,8 @@
             <w:tcW w:w="1212" w:type="dxa"/>
           </w:tcPr>
           <w:p>
-            <w:pPr>
-              <w:pStyle w:val="Compact"/>
-              <w:jc w:val="right"/>
-            </w:pPr>
-            <w:r>
-              <w:t>Detected by Agent</w:t>
+            <w:r>
+              <w:t>Average Findings (5 Runs)</w:t>
             </w:r>
           </w:p>
         </w:tc>
@@ -2143,10 +2129,6 @@
             <w:tcW w:w="998" w:type="dxa"/>
           </w:tcPr>
           <w:p>
-            <w:pPr>
-              <w:pStyle w:val="Compact"/>
-              <w:jc w:val="right"/>
-            </w:pPr>
             <w:r>
               <w:t>Detection Rate</w:t>
             </w:r>
@@ -2157,9 +2139,6 @@
             <w:tcW w:w="570" w:type="dxa"/>
           </w:tcPr>
           <w:p>
-            <w:pPr>
-              <w:pStyle w:val="Compact"/>
-            </w:pPr>
             <w:r>
               <w:t>Severity</w:t>
             </w:r>
@@ -2172,9 +2151,6 @@
             <w:tcW w:w="1355" w:type="dxa"/>
           </w:tcPr>
           <w:p>
-            <w:pPr>
-              <w:pStyle w:val="Compact"/>
-            </w:pPr>
             <w:r>
               <w:t>E-Commerce (5002)</w:t>
             </w:r>
@@ -2185,11 +2161,8 @@
             <w:tcW w:w="2782" w:type="dxa"/>
           </w:tcPr>
           <w:p>
-            <w:pPr>
-              <w:pStyle w:val="Compact"/>
-            </w:pPr>
-            <w:r>
-              <w:t>SQL Injection</w:t>
+            <w:r>
+              <w:t>Mass Assignment</w:t>
             </w:r>
           </w:p>
         </w:tc>
@@ -2198,12 +2171,8 @@
             <w:tcW w:w="998" w:type="dxa"/>
           </w:tcPr>
           <w:p>
-            <w:pPr>
-              <w:pStyle w:val="Compact"/>
-              <w:jc w:val="right"/>
-            </w:pPr>
-            <w:r>
-              <w:t>3</w:t>
+            <w:r>
+              <w:t>1</w:t>
             </w:r>
           </w:p>
         </w:tc>
@@ -2212,12 +2181,8 @@
             <w:tcW w:w="1212" w:type="dxa"/>
           </w:tcPr>
           <w:p>
-            <w:pPr>
-              <w:pStyle w:val="Compact"/>
-              <w:jc w:val="right"/>
-            </w:pPr>
-            <w:r>
-              <w:t>2</w:t>
+            <w:r>
+              <w:t>0.0</w:t>
             </w:r>
           </w:p>
         </w:tc>
@@ -2226,12 +2191,8 @@
             <w:tcW w:w="998" w:type="dxa"/>
           </w:tcPr>
           <w:p>
-            <w:pPr>
-              <w:pStyle w:val="Compact"/>
-              <w:jc w:val="right"/>
-            </w:pPr>
-            <w:r>
-              <w:t>67%</w:t>
+            <w:r>
+              <w:t>0.0%</w:t>
             </w:r>
           </w:p>
         </w:tc>
@@ -2240,11 +2201,8 @@
             <w:tcW w:w="570" w:type="dxa"/>
           </w:tcPr>
           <w:p>
-            <w:pPr>
-              <w:pStyle w:val="Compact"/>
-            </w:pPr>
-            <w:r>
-              <w:t>Critical</w:t>
+            <w:r>
+              <w:t>High</w:t>
             </w:r>
           </w:p>
         </w:tc>
@@ -2255,9 +2213,6 @@
             <w:tcW w:w="1355" w:type="dxa"/>
           </w:tcPr>
           <w:p>
-            <w:pPr>
-              <w:pStyle w:val="Compact"/>
-            </w:pPr>
             <w:r>
               <w:t>E-Commerce (5002)</w:t>
             </w:r>
@@ -2268,11 +2223,8 @@
             <w:tcW w:w="2782" w:type="dxa"/>
           </w:tcPr>
           <w:p>
-            <w:pPr>
-              <w:pStyle w:val="Compact"/>
-            </w:pPr>
-            <w:r>
-              <w:t>Cross-Site Scripting (XSS)</w:t>
+            <w:r>
+              <w:t>SQL Injection</w:t>
             </w:r>
           </w:p>
         </w:tc>
@@ -2281,12 +2233,8 @@
             <w:tcW w:w="998" w:type="dxa"/>
           </w:tcPr>
           <w:p>
-            <w:pPr>
-              <w:pStyle w:val="Compact"/>
-              <w:jc w:val="right"/>
-            </w:pPr>
-            <w:r>
-              <w:t>2</w:t>
+            <w:r>
+              <w:t>3</w:t>
             </w:r>
           </w:p>
         </w:tc>
@@ -2295,12 +2243,8 @@
             <w:tcW w:w="1212" w:type="dxa"/>
           </w:tcPr>
           <w:p>
-            <w:pPr>
-              <w:pStyle w:val="Compact"/>
-              <w:jc w:val="right"/>
-            </w:pPr>
-            <w:r>
-              <w:t>2</w:t>
+            <w:r>
+              <w:t>2.0</w:t>
             </w:r>
           </w:p>
         </w:tc>
@@ -2309,12 +2253,8 @@
             <w:tcW w:w="998" w:type="dxa"/>
           </w:tcPr>
           <w:p>
-            <w:pPr>
-              <w:pStyle w:val="Compact"/>
-              <w:jc w:val="right"/>
-            </w:pPr>
-            <w:r>
-              <w:t>100%</w:t>
+            <w:r>
+              <w:t>66.7%</w:t>
             </w:r>
           </w:p>
         </w:tc>
@@ -2323,11 +2263,8 @@
             <w:tcW w:w="570" w:type="dxa"/>
           </w:tcPr>
           <w:p>
-            <w:pPr>
-              <w:pStyle w:val="Compact"/>
-            </w:pPr>
-            <w:r>
-              <w:t>High</w:t>
+            <w:r>
+              <w:t>Critical</w:t>
             </w:r>
           </w:p>
         </w:tc>
@@ -2338,9 +2275,6 @@
             <w:tcW w:w="1355" w:type="dxa"/>
           </w:tcPr>
           <w:p>
-            <w:pPr>
-              <w:pStyle w:val="Compact"/>
-            </w:pPr>
             <w:r>
               <w:t>E-Commerce (5002)</w:t>
             </w:r>
@@ -2351,11 +2285,8 @@
             <w:tcW w:w="2782" w:type="dxa"/>
           </w:tcPr>
           <w:p>
-            <w:pPr>
-              <w:pStyle w:val="Compact"/>
-            </w:pPr>
-            <w:r>
-              <w:t>Insecure Direct Object Reference (IDOR)</w:t>
+            <w:r>
+              <w:t>JWT Bypass</w:t>
             </w:r>
           </w:p>
         </w:tc>
@@ -2364,12 +2295,8 @@
             <w:tcW w:w="998" w:type="dxa"/>
           </w:tcPr>
           <w:p>
-            <w:pPr>
-              <w:pStyle w:val="Compact"/>
-              <w:jc w:val="right"/>
-            </w:pPr>
-            <w:r>
-              <w:t>4</w:t>
+            <w:r>
+              <w:t>3</w:t>
             </w:r>
           </w:p>
         </w:tc>
@@ -2378,12 +2305,8 @@
             <w:tcW w:w="1212" w:type="dxa"/>
           </w:tcPr>
           <w:p>
-            <w:pPr>
-              <w:pStyle w:val="Compact"/>
-              <w:jc w:val="right"/>
-            </w:pPr>
-            <w:r>
-              <w:t>1</w:t>
+            <w:r>
+              <w:t>0.0</w:t>
             </w:r>
           </w:p>
         </w:tc>
@@ -2392,12 +2315,8 @@
             <w:tcW w:w="998" w:type="dxa"/>
           </w:tcPr>
           <w:p>
-            <w:pPr>
-              <w:pStyle w:val="Compact"/>
-              <w:jc w:val="right"/>
-            </w:pPr>
-            <w:r>
-              <w:t>25%</w:t>
+            <w:r>
+              <w:t>0.0%</w:t>
             </w:r>
           </w:p>
         </w:tc>
@@ -2406,11 +2325,8 @@
             <w:tcW w:w="570" w:type="dxa"/>
           </w:tcPr>
           <w:p>
-            <w:pPr>
-              <w:pStyle w:val="Compact"/>
-            </w:pPr>
-            <w:r>
-              <w:t>Medium</w:t>
+            <w:r>
+              <w:t>High</w:t>
             </w:r>
           </w:p>
         </w:tc>
@@ -2421,9 +2337,6 @@
             <w:tcW w:w="1355" w:type="dxa"/>
           </w:tcPr>
           <w:p>
-            <w:pPr>
-              <w:pStyle w:val="Compact"/>
-            </w:pPr>
             <w:r>
               <w:t>E-Commerce (5002)</w:t>
             </w:r>
@@ -2434,11 +2347,8 @@
             <w:tcW w:w="2782" w:type="dxa"/>
           </w:tcPr>
           <w:p>
-            <w:pPr>
-              <w:pStyle w:val="Compact"/>
-            </w:pPr>
-            <w:r>
-              <w:t>Broken Access Control (BAC)</w:t>
+            <w:r>
+              <w:t>Insecure Direct Object Reference (IDOR)</w:t>
             </w:r>
           </w:p>
         </w:tc>
@@ -2447,12 +2357,8 @@
             <w:tcW w:w="998" w:type="dxa"/>
           </w:tcPr>
           <w:p>
-            <w:pPr>
-              <w:pStyle w:val="Compact"/>
-              <w:jc w:val="right"/>
-            </w:pPr>
-            <w:r>
-              <w:t>1</w:t>
+            <w:r>
+              <w:t>4</w:t>
             </w:r>
           </w:p>
         </w:tc>
@@ -2461,12 +2367,8 @@
             <w:tcW w:w="1212" w:type="dxa"/>
           </w:tcPr>
           <w:p>
-            <w:pPr>
-              <w:pStyle w:val="Compact"/>
-              <w:jc w:val="right"/>
-            </w:pPr>
-            <w:r>
-              <w:t>1</w:t>
+            <w:r>
+              <w:t>2.0</w:t>
             </w:r>
           </w:p>
         </w:tc>
@@ -2475,12 +2377,8 @@
             <w:tcW w:w="998" w:type="dxa"/>
           </w:tcPr>
           <w:p>
-            <w:pPr>
-              <w:pStyle w:val="Compact"/>
-              <w:jc w:val="right"/>
-            </w:pPr>
-            <w:r>
-              <w:t>100%</w:t>
+            <w:r>
+              <w:t>50.0%</w:t>
             </w:r>
           </w:p>
         </w:tc>
@@ -2489,11 +2387,8 @@
             <w:tcW w:w="570" w:type="dxa"/>
           </w:tcPr>
           <w:p>
-            <w:pPr>
-              <w:pStyle w:val="Compact"/>
-            </w:pPr>
-            <w:r>
-              <w:t>Critical</w:t>
+            <w:r>
+              <w:t>Medium</w:t>
             </w:r>
           </w:p>
         </w:tc>
@@ -2504,9 +2399,6 @@
             <w:tcW w:w="1355" w:type="dxa"/>
           </w:tcPr>
           <w:p>
-            <w:pPr>
-              <w:pStyle w:val="Compact"/>
-            </w:pPr>
             <w:r>
               <w:t>E-Commerce (5002)</w:t>
             </w:r>
@@ -2517,11 +2409,8 @@
             <w:tcW w:w="2782" w:type="dxa"/>
           </w:tcPr>
           <w:p>
-            <w:pPr>
-              <w:pStyle w:val="Compact"/>
-            </w:pPr>
-            <w:r>
-              <w:t>Insecure Deserialization</w:t>
+            <w:r>
+              <w:t>Business Logic</w:t>
             </w:r>
           </w:p>
         </w:tc>
@@ -2530,12 +2419,8 @@
             <w:tcW w:w="998" w:type="dxa"/>
           </w:tcPr>
           <w:p>
-            <w:pPr>
-              <w:pStyle w:val="Compact"/>
-              <w:jc w:val="right"/>
-            </w:pPr>
-            <w:r>
-              <w:t>1</w:t>
+            <w:r>
+              <w:t>4</w:t>
             </w:r>
           </w:p>
         </w:tc>
@@ -2544,12 +2429,8 @@
             <w:tcW w:w="1212" w:type="dxa"/>
           </w:tcPr>
           <w:p>
-            <w:pPr>
-              <w:pStyle w:val="Compact"/>
-              <w:jc w:val="right"/>
-            </w:pPr>
-            <w:r>
-              <w:t>0</w:t>
+            <w:r>
+              <w:t>0.0</w:t>
             </w:r>
           </w:p>
         </w:tc>
@@ -2558,12 +2439,8 @@
             <w:tcW w:w="998" w:type="dxa"/>
           </w:tcPr>
           <w:p>
-            <w:pPr>
-              <w:pStyle w:val="Compact"/>
-              <w:jc w:val="right"/>
-            </w:pPr>
-            <w:r>
-              <w:t>0%</w:t>
+            <w:r>
+              <w:t>0.0%</w:t>
             </w:r>
           </w:p>
         </w:tc>
@@ -2572,11 +2449,8 @@
             <w:tcW w:w="570" w:type="dxa"/>
           </w:tcPr>
           <w:p>
-            <w:pPr>
-              <w:pStyle w:val="Compact"/>
-            </w:pPr>
-            <w:r>
-              <w:t>Critical</w:t>
+            <w:r>
+              <w:t>Medium</w:t>
             </w:r>
           </w:p>
         </w:tc>
@@ -2587,9 +2461,6 @@
             <w:tcW w:w="1355" w:type="dxa"/>
           </w:tcPr>
           <w:p>
-            <w:pPr>
-              <w:pStyle w:val="Compact"/>
-            </w:pPr>
             <w:r>
               <w:t>E-Commerce (5002)</w:t>
             </w:r>
@@ -2600,11 +2471,8 @@
             <w:tcW w:w="2782" w:type="dxa"/>
           </w:tcPr>
           <w:p>
-            <w:pPr>
-              <w:pStyle w:val="Compact"/>
-            </w:pPr>
-            <w:r>
-              <w:t>Mass Assignment</w:t>
+            <w:r>
+              <w:t>Cross-Site Scripting (XSS)</w:t>
             </w:r>
           </w:p>
         </w:tc>
@@ -2613,12 +2481,8 @@
             <w:tcW w:w="998" w:type="dxa"/>
           </w:tcPr>
           <w:p>
-            <w:pPr>
-              <w:pStyle w:val="Compact"/>
-              <w:jc w:val="right"/>
-            </w:pPr>
-            <w:r>
-              <w:t>1</w:t>
+            <w:r>
+              <w:t>2</w:t>
             </w:r>
           </w:p>
         </w:tc>
@@ -2627,12 +2491,8 @@
             <w:tcW w:w="1212" w:type="dxa"/>
           </w:tcPr>
           <w:p>
-            <w:pPr>
-              <w:pStyle w:val="Compact"/>
-              <w:jc w:val="right"/>
-            </w:pPr>
-            <w:r>
-              <w:t>0</w:t>
+            <w:r>
+              <w:t>1.0</w:t>
             </w:r>
           </w:p>
         </w:tc>
@@ -2641,12 +2501,8 @@
             <w:tcW w:w="998" w:type="dxa"/>
           </w:tcPr>
           <w:p>
-            <w:pPr>
-              <w:pStyle w:val="Compact"/>
-              <w:jc w:val="right"/>
-            </w:pPr>
-            <w:r>
-              <w:t>0%</w:t>
+            <w:r>
+              <w:t>50.0%</w:t>
             </w:r>
           </w:p>
         </w:tc>
@@ -2655,9 +2511,6 @@
             <w:tcW w:w="570" w:type="dxa"/>
           </w:tcPr>
           <w:p>
-            <w:pPr>
-              <w:pStyle w:val="Compact"/>
-            </w:pPr>
             <w:r>
               <w:t>High</w:t>
             </w:r>
@@ -2670,9 +2523,6 @@
             <w:tcW w:w="1355" w:type="dxa"/>
           </w:tcPr>
           <w:p>
-            <w:pPr>
-              <w:pStyle w:val="Compact"/>
-            </w:pPr>
             <w:r>
               <w:t>E-Commerce (5002)</w:t>
             </w:r>
@@ -2683,11 +2533,8 @@
             <w:tcW w:w="2782" w:type="dxa"/>
           </w:tcPr>
           <w:p>
-            <w:pPr>
-              <w:pStyle w:val="Compact"/>
-            </w:pPr>
-            <w:r>
-              <w:t>Business Logic</w:t>
+            <w:r>
+              <w:t>Broken Access Control (BAC)</w:t>
             </w:r>
           </w:p>
         </w:tc>
@@ -2696,12 +2543,8 @@
             <w:tcW w:w="998" w:type="dxa"/>
           </w:tcPr>
           <w:p>
-            <w:pPr>
-              <w:pStyle w:val="Compact"/>
-              <w:jc w:val="right"/>
-            </w:pPr>
-            <w:r>
-              <w:t>4</w:t>
+            <w:r>
+              <w:t>1</w:t>
             </w:r>
           </w:p>
         </w:tc>
@@ -2710,12 +2553,8 @@
             <w:tcW w:w="1212" w:type="dxa"/>
           </w:tcPr>
           <w:p>
-            <w:pPr>
-              <w:pStyle w:val="Compact"/>
-              <w:jc w:val="right"/>
-            </w:pPr>
-            <w:r>
-              <w:t>1</w:t>
+            <w:r>
+              <w:t>0.0</w:t>
             </w:r>
           </w:p>
         </w:tc>
@@ -2724,12 +2563,8 @@
             <w:tcW w:w="998" w:type="dxa"/>
           </w:tcPr>
           <w:p>
-            <w:pPr>
-              <w:pStyle w:val="Compact"/>
-              <w:jc w:val="right"/>
-            </w:pPr>
-            <w:r>
-              <w:t>25%</w:t>
+            <w:r>
+              <w:t>0.0%</w:t>
             </w:r>
           </w:p>
         </w:tc>
@@ -2738,11 +2573,8 @@
             <w:tcW w:w="570" w:type="dxa"/>
           </w:tcPr>
           <w:p>
-            <w:pPr>
-              <w:pStyle w:val="Compact"/>
-            </w:pPr>
-            <w:r>
-              <w:t>Medium</w:t>
+            <w:r>
+              <w:t>Critical</w:t>
             </w:r>
           </w:p>
         </w:tc>
@@ -2753,9 +2585,6 @@
             <w:tcW w:w="1355" w:type="dxa"/>
           </w:tcPr>
           <w:p>
-            <w:pPr>
-              <w:pStyle w:val="Compact"/>
-            </w:pPr>
             <w:r>
               <w:t>E-Commerce (5002)</w:t>
             </w:r>
@@ -2766,9 +2595,6 @@
             <w:tcW w:w="2782" w:type="dxa"/>
           </w:tcPr>
           <w:p>
-            <w:pPr>
-              <w:pStyle w:val="Compact"/>
-            </w:pPr>
             <w:r>
               <w:t>Sensitive Data Exposure</w:t>
             </w:r>
@@ -2779,10 +2605,6 @@
             <w:tcW w:w="998" w:type="dxa"/>
           </w:tcPr>
           <w:p>
-            <w:pPr>
-              <w:pStyle w:val="Compact"/>
-              <w:jc w:val="right"/>
-            </w:pPr>
             <w:r>
               <w:t>1</w:t>
             </w:r>
@@ -2793,12 +2615,8 @@
             <w:tcW w:w="1212" w:type="dxa"/>
           </w:tcPr>
           <w:p>
-            <w:pPr>
-              <w:pStyle w:val="Compact"/>
-              <w:jc w:val="right"/>
-            </w:pPr>
-            <w:r>
-              <w:t>1</w:t>
+            <w:r>
+              <w:t>0.0</w:t>
             </w:r>
           </w:p>
         </w:tc>
@@ -2807,12 +2625,8 @@
             <w:tcW w:w="998" w:type="dxa"/>
           </w:tcPr>
           <w:p>
-            <w:pPr>
-              <w:pStyle w:val="Compact"/>
-              <w:jc w:val="right"/>
-            </w:pPr>
-            <w:r>
-              <w:t>100%</w:t>
+            <w:r>
+              <w:t>0.0%</w:t>
             </w:r>
           </w:p>
         </w:tc>
@@ -2821,9 +2635,6 @@
             <w:tcW w:w="570" w:type="dxa"/>
           </w:tcPr>
           <w:p>
-            <w:pPr>
-              <w:pStyle w:val="Compact"/>
-            </w:pPr>
             <w:r>
               <w:t>High</w:t>
             </w:r>
@@ -2836,9 +2647,6 @@
             <w:tcW w:w="1355" w:type="dxa"/>
           </w:tcPr>
           <w:p>
-            <w:pPr>
-              <w:pStyle w:val="Compact"/>
-            </w:pPr>
             <w:r>
               <w:t>E-Commerce (5002)</w:t>
             </w:r>
@@ -2849,11 +2657,8 @@
             <w:tcW w:w="2782" w:type="dxa"/>
           </w:tcPr>
           <w:p>
-            <w:pPr>
-              <w:pStyle w:val="Compact"/>
-            </w:pPr>
-            <w:r>
-              <w:t>JWT Bypass</w:t>
+            <w:r>
+              <w:t>Insecure Deserialization</w:t>
             </w:r>
           </w:p>
         </w:tc>
@@ -2862,12 +2667,8 @@
             <w:tcW w:w="998" w:type="dxa"/>
           </w:tcPr>
           <w:p>
-            <w:pPr>
-              <w:pStyle w:val="Compact"/>
-              <w:jc w:val="right"/>
-            </w:pPr>
-            <w:r>
-              <w:t>3</w:t>
+            <w:r>
+              <w:t>1</w:t>
             </w:r>
           </w:p>
         </w:tc>
@@ -2876,12 +2677,8 @@
             <w:tcW w:w="1212" w:type="dxa"/>
           </w:tcPr>
           <w:p>
-            <w:pPr>
-              <w:pStyle w:val="Compact"/>
-              <w:jc w:val="right"/>
-            </w:pPr>
-            <w:r>
-              <w:t>0</w:t>
+            <w:r>
+              <w:t>0.0</w:t>
             </w:r>
           </w:p>
         </w:tc>
@@ -2890,12 +2687,8 @@
             <w:tcW w:w="998" w:type="dxa"/>
           </w:tcPr>
           <w:p>
-            <w:pPr>
-              <w:pStyle w:val="Compact"/>
-              <w:jc w:val="right"/>
-            </w:pPr>
-            <w:r>
-              <w:t>0%</w:t>
+            <w:r>
+              <w:t>0.0%</w:t>
             </w:r>
           </w:p>
         </w:tc>
@@ -2904,11 +2697,8 @@
             <w:tcW w:w="570" w:type="dxa"/>
           </w:tcPr>
           <w:p>
-            <w:pPr>
-              <w:pStyle w:val="Compact"/>
-            </w:pPr>
-            <w:r>
-              <w:t>High</w:t>
+            <w:r>
+              <w:t>Critical</w:t>
             </w:r>
           </w:p>
         </w:tc>
@@ -2919,9 +2709,6 @@
             <w:tcW w:w="1355" w:type="dxa"/>
           </w:tcPr>
           <w:p>
-            <w:pPr>
-              <w:pStyle w:val="Compact"/>
-            </w:pPr>
             <w:r>
               <w:t>Social Media (5003)</w:t>
             </w:r>
@@ -2932,11 +2719,8 @@
             <w:tcW w:w="2782" w:type="dxa"/>
           </w:tcPr>
           <w:p>
-            <w:pPr>
-              <w:pStyle w:val="Compact"/>
-            </w:pPr>
-            <w:r>
-              <w:t>SQL Injection</w:t>
+            <w:r>
+              <w:t>Weak Password</w:t>
             </w:r>
           </w:p>
         </w:tc>
@@ -2945,12 +2729,8 @@
             <w:tcW w:w="998" w:type="dxa"/>
           </w:tcPr>
           <w:p>
-            <w:pPr>
-              <w:pStyle w:val="Compact"/>
-              <w:jc w:val="right"/>
-            </w:pPr>
-            <w:r>
-              <w:t>2</w:t>
+            <w:r>
+              <w:t>1</w:t>
             </w:r>
           </w:p>
         </w:tc>
@@ -2959,12 +2739,8 @@
             <w:tcW w:w="1212" w:type="dxa"/>
           </w:tcPr>
           <w:p>
-            <w:pPr>
-              <w:pStyle w:val="Compact"/>
-              <w:jc w:val="right"/>
-            </w:pPr>
-            <w:r>
-              <w:t>1</w:t>
+            <w:r>
+              <w:t>0.0</w:t>
             </w:r>
           </w:p>
         </w:tc>
@@ -2973,12 +2749,8 @@
             <w:tcW w:w="998" w:type="dxa"/>
           </w:tcPr>
           <w:p>
-            <w:pPr>
-              <w:pStyle w:val="Compact"/>
-              <w:jc w:val="right"/>
-            </w:pPr>
-            <w:r>
-              <w:t>50%</w:t>
+            <w:r>
+              <w:t>0.0%</w:t>
             </w:r>
           </w:p>
         </w:tc>
@@ -2987,11 +2759,8 @@
             <w:tcW w:w="570" w:type="dxa"/>
           </w:tcPr>
           <w:p>
-            <w:pPr>
-              <w:pStyle w:val="Compact"/>
-            </w:pPr>
-            <w:r>
-              <w:t>Critical</w:t>
+            <w:r>
+              <w:t>High</w:t>
             </w:r>
           </w:p>
         </w:tc>
@@ -3002,9 +2771,6 @@
             <w:tcW w:w="1355" w:type="dxa"/>
           </w:tcPr>
           <w:p>
-            <w:pPr>
-              <w:pStyle w:val="Compact"/>
-            </w:pPr>
             <w:r>
               <w:t>Social Media (5003)</w:t>
             </w:r>
@@ -3015,11 +2781,8 @@
             <w:tcW w:w="2782" w:type="dxa"/>
           </w:tcPr>
           <w:p>
-            <w:pPr>
-              <w:pStyle w:val="Compact"/>
-            </w:pPr>
-            <w:r>
-              <w:t>Cross-Site Scripting (XSS)</w:t>
+            <w:r>
+              <w:t>Session Fixation</w:t>
             </w:r>
           </w:p>
         </w:tc>
@@ -3028,12 +2791,8 @@
             <w:tcW w:w="998" w:type="dxa"/>
           </w:tcPr>
           <w:p>
-            <w:pPr>
-              <w:pStyle w:val="Compact"/>
-              <w:jc w:val="right"/>
-            </w:pPr>
-            <w:r>
-              <w:t>3</w:t>
+            <w:r>
+              <w:t>1</w:t>
             </w:r>
           </w:p>
         </w:tc>
@@ -3042,12 +2801,8 @@
             <w:tcW w:w="1212" w:type="dxa"/>
           </w:tcPr>
           <w:p>
-            <w:pPr>
-              <w:pStyle w:val="Compact"/>
-              <w:jc w:val="right"/>
-            </w:pPr>
-            <w:r>
-              <w:t>1</w:t>
+            <w:r>
+              <w:t>0.0</w:t>
             </w:r>
           </w:p>
         </w:tc>
@@ -3056,12 +2811,8 @@
             <w:tcW w:w="998" w:type="dxa"/>
           </w:tcPr>
           <w:p>
-            <w:pPr>
-              <w:pStyle w:val="Compact"/>
-              <w:jc w:val="right"/>
-            </w:pPr>
-            <w:r>
-              <w:t>33%</w:t>
+            <w:r>
+              <w:t>0.0%</w:t>
             </w:r>
           </w:p>
         </w:tc>
@@ -3070,9 +2821,6 @@
             <w:tcW w:w="570" w:type="dxa"/>
           </w:tcPr>
           <w:p>
-            <w:pPr>
-              <w:pStyle w:val="Compact"/>
-            </w:pPr>
             <w:r>
               <w:t>High</w:t>
             </w:r>
@@ -3085,9 +2833,6 @@
             <w:tcW w:w="1355" w:type="dxa"/>
           </w:tcPr>
           <w:p>
-            <w:pPr>
-              <w:pStyle w:val="Compact"/>
-            </w:pPr>
             <w:r>
               <w:t>Social Media (5003)</w:t>
             </w:r>
@@ -3098,11 +2843,8 @@
             <w:tcW w:w="2782" w:type="dxa"/>
           </w:tcPr>
           <w:p>
-            <w:pPr>
-              <w:pStyle w:val="Compact"/>
-            </w:pPr>
-            <w:r>
-              <w:t>Insecure Direct Object Reference (IDOR)</w:t>
+            <w:r>
+              <w:t>Weak Reset Token</w:t>
             </w:r>
           </w:p>
         </w:tc>
@@ -3111,12 +2853,8 @@
             <w:tcW w:w="998" w:type="dxa"/>
           </w:tcPr>
           <w:p>
-            <w:pPr>
-              <w:pStyle w:val="Compact"/>
-              <w:jc w:val="right"/>
-            </w:pPr>
-            <w:r>
-              <w:t>6</w:t>
+            <w:r>
+              <w:t>1</w:t>
             </w:r>
           </w:p>
         </w:tc>
@@ -3125,12 +2863,8 @@
             <w:tcW w:w="1212" w:type="dxa"/>
           </w:tcPr>
           <w:p>
-            <w:pPr>
-              <w:pStyle w:val="Compact"/>
-              <w:jc w:val="right"/>
-            </w:pPr>
-            <w:r>
-              <w:t>0</w:t>
+            <w:r>
+              <w:t>0.0</w:t>
             </w:r>
           </w:p>
         </w:tc>
@@ -3139,12 +2873,8 @@
             <w:tcW w:w="998" w:type="dxa"/>
           </w:tcPr>
           <w:p>
-            <w:pPr>
-              <w:pStyle w:val="Compact"/>
-              <w:jc w:val="right"/>
-            </w:pPr>
-            <w:r>
-              <w:t>0%</w:t>
+            <w:r>
+              <w:t>0.0%</w:t>
             </w:r>
           </w:p>
         </w:tc>
@@ -3153,11 +2883,8 @@
             <w:tcW w:w="570" w:type="dxa"/>
           </w:tcPr>
           <w:p>
-            <w:pPr>
-              <w:pStyle w:val="Compact"/>
-            </w:pPr>
-            <w:r>
-              <w:t>Medium</w:t>
+            <w:r>
+              <w:t>High</w:t>
             </w:r>
           </w:p>
         </w:tc>
@@ -3168,9 +2895,6 @@
             <w:tcW w:w="1355" w:type="dxa"/>
           </w:tcPr>
           <w:p>
-            <w:pPr>
-              <w:pStyle w:val="Compact"/>
-            </w:pPr>
             <w:r>
               <w:t>Social Media (5003)</w:t>
             </w:r>
@@ -3181,11 +2905,8 @@
             <w:tcW w:w="2782" w:type="dxa"/>
           </w:tcPr>
           <w:p>
-            <w:pPr>
-              <w:pStyle w:val="Compact"/>
-            </w:pPr>
-            <w:r>
-              <w:t>Cross-Site Request Forgery (CSRF)</w:t>
+            <w:r>
+              <w:t>OAuth Bypass</w:t>
             </w:r>
           </w:p>
         </w:tc>
@@ -3194,10 +2915,6 @@
             <w:tcW w:w="998" w:type="dxa"/>
           </w:tcPr>
           <w:p>
-            <w:pPr>
-              <w:pStyle w:val="Compact"/>
-              <w:jc w:val="right"/>
-            </w:pPr>
             <w:r>
               <w:t>1</w:t>
             </w:r>
@@ -3208,12 +2925,8 @@
             <w:tcW w:w="1212" w:type="dxa"/>
           </w:tcPr>
           <w:p>
-            <w:pPr>
-              <w:pStyle w:val="Compact"/>
-              <w:jc w:val="right"/>
-            </w:pPr>
-            <w:r>
-              <w:t>1</w:t>
+            <w:r>
+              <w:t>0.0</w:t>
             </w:r>
           </w:p>
         </w:tc>
@@ -3222,12 +2935,8 @@
             <w:tcW w:w="998" w:type="dxa"/>
           </w:tcPr>
           <w:p>
-            <w:pPr>
-              <w:pStyle w:val="Compact"/>
-              <w:jc w:val="right"/>
-            </w:pPr>
-            <w:r>
-              <w:t>100%</w:t>
+            <w:r>
+              <w:t>0.0%</w:t>
             </w:r>
           </w:p>
         </w:tc>
@@ -3236,11 +2945,8 @@
             <w:tcW w:w="570" w:type="dxa"/>
           </w:tcPr>
           <w:p>
-            <w:pPr>
-              <w:pStyle w:val="Compact"/>
-            </w:pPr>
-            <w:r>
-              <w:t>Medium</w:t>
+            <w:r>
+              <w:t>High</w:t>
             </w:r>
           </w:p>
         </w:tc>
@@ -3251,11 +2957,7 @@
             <w:tcW w:w="1355" w:type="dxa"/>
           </w:tcPr>
           <w:p>
-            <w:pPr>
-              <w:pStyle w:val="Compact"/>
-            </w:pPr>
-            <w:r>
-              <w:lastRenderedPageBreak/>
+            <w:r>
               <w:t>Social Media (5003)</w:t>
             </w:r>
           </w:p>
@@ -3265,11 +2967,8 @@
             <w:tcW w:w="2782" w:type="dxa"/>
           </w:tcPr>
           <w:p>
-            <w:pPr>
-              <w:pStyle w:val="Compact"/>
-            </w:pPr>
-            <w:r>
-              <w:t>File Upload</w:t>
+            <w:r>
+              <w:t>Insecure Direct Object Reference (IDOR)</w:t>
             </w:r>
           </w:p>
         </w:tc>
@@ -3278,12 +2977,8 @@
             <w:tcW w:w="998" w:type="dxa"/>
           </w:tcPr>
           <w:p>
-            <w:pPr>
-              <w:pStyle w:val="Compact"/>
-              <w:jc w:val="right"/>
-            </w:pPr>
-            <w:r>
-              <w:t>2</w:t>
+            <w:r>
+              <w:t>6</w:t>
             </w:r>
           </w:p>
         </w:tc>
@@ -3292,12 +2987,8 @@
             <w:tcW w:w="1212" w:type="dxa"/>
           </w:tcPr>
           <w:p>
-            <w:pPr>
-              <w:pStyle w:val="Compact"/>
-              <w:jc w:val="right"/>
-            </w:pPr>
-            <w:r>
-              <w:t>0</w:t>
+            <w:r>
+              <w:t>1.8</w:t>
             </w:r>
           </w:p>
         </w:tc>
@@ -3306,12 +2997,8 @@
             <w:tcW w:w="998" w:type="dxa"/>
           </w:tcPr>
           <w:p>
-            <w:pPr>
-              <w:pStyle w:val="Compact"/>
-              <w:jc w:val="right"/>
-            </w:pPr>
-            <w:r>
-              <w:t>0%</w:t>
+            <w:r>
+              <w:t>30.0%</w:t>
             </w:r>
           </w:p>
         </w:tc>
@@ -3320,11 +3007,8 @@
             <w:tcW w:w="570" w:type="dxa"/>
           </w:tcPr>
           <w:p>
-            <w:pPr>
-              <w:pStyle w:val="Compact"/>
-            </w:pPr>
-            <w:r>
-              <w:t>Critical</w:t>
+            <w:r>
+              <w:t>Medium</w:t>
             </w:r>
           </w:p>
         </w:tc>
@@ -3335,9 +3019,6 @@
             <w:tcW w:w="1355" w:type="dxa"/>
           </w:tcPr>
           <w:p>
-            <w:pPr>
-              <w:pStyle w:val="Compact"/>
-            </w:pPr>
             <w:r>
               <w:t>Social Media (5003)</w:t>
             </w:r>
@@ -3348,11 +3029,8 @@
             <w:tcW w:w="2782" w:type="dxa"/>
           </w:tcPr>
           <w:p>
-            <w:pPr>
-              <w:pStyle w:val="Compact"/>
-            </w:pPr>
-            <w:r>
-              <w:t>Path Traversal</w:t>
+            <w:r>
+              <w:t>Cross-Site Scripting (XSS)</w:t>
             </w:r>
           </w:p>
         </w:tc>
@@ -3361,12 +3039,8 @@
             <w:tcW w:w="998" w:type="dxa"/>
           </w:tcPr>
           <w:p>
-            <w:pPr>
-              <w:pStyle w:val="Compact"/>
-              <w:jc w:val="right"/>
-            </w:pPr>
-            <w:r>
-              <w:t>1</w:t>
+            <w:r>
+              <w:t>3</w:t>
             </w:r>
           </w:p>
         </w:tc>
@@ -3375,12 +3049,8 @@
             <w:tcW w:w="1212" w:type="dxa"/>
           </w:tcPr>
           <w:p>
-            <w:pPr>
-              <w:pStyle w:val="Compact"/>
-              <w:jc w:val="right"/>
-            </w:pPr>
-            <w:r>
-              <w:t>0</w:t>
+            <w:r>
+              <w:t>0.6</w:t>
             </w:r>
           </w:p>
         </w:tc>
@@ -3389,12 +3059,8 @@
             <w:tcW w:w="998" w:type="dxa"/>
           </w:tcPr>
           <w:p>
-            <w:pPr>
-              <w:pStyle w:val="Compact"/>
-              <w:jc w:val="right"/>
-            </w:pPr>
-            <w:r>
-              <w:t>0%</w:t>
+            <w:r>
+              <w:t>20.0%</w:t>
             </w:r>
           </w:p>
         </w:tc>
@@ -3403,9 +3069,6 @@
             <w:tcW w:w="570" w:type="dxa"/>
           </w:tcPr>
           <w:p>
-            <w:pPr>
-              <w:pStyle w:val="Compact"/>
-            </w:pPr>
             <w:r>
               <w:t>High</w:t>
             </w:r>
@@ -3418,9 +3081,6 @@
             <w:tcW w:w="1355" w:type="dxa"/>
           </w:tcPr>
           <w:p>
-            <w:pPr>
-              <w:pStyle w:val="Compact"/>
-            </w:pPr>
             <w:r>
               <w:t>Social Media (5003)</w:t>
             </w:r>
@@ -3431,11 +3091,8 @@
             <w:tcW w:w="2782" w:type="dxa"/>
           </w:tcPr>
           <w:p>
-            <w:pPr>
-              <w:pStyle w:val="Compact"/>
-            </w:pPr>
-            <w:r>
-              <w:t>Session Fixation</w:t>
+            <w:r>
+              <w:t>File Upload</w:t>
             </w:r>
           </w:p>
         </w:tc>
@@ -3444,12 +3101,8 @@
             <w:tcW w:w="998" w:type="dxa"/>
           </w:tcPr>
           <w:p>
-            <w:pPr>
-              <w:pStyle w:val="Compact"/>
-              <w:jc w:val="right"/>
-            </w:pPr>
-            <w:r>
-              <w:t>1</w:t>
+            <w:r>
+              <w:t>2</w:t>
             </w:r>
           </w:p>
         </w:tc>
@@ -3458,12 +3111,8 @@
             <w:tcW w:w="1212" w:type="dxa"/>
           </w:tcPr>
           <w:p>
-            <w:pPr>
-              <w:pStyle w:val="Compact"/>
-              <w:jc w:val="right"/>
-            </w:pPr>
-            <w:r>
-              <w:t>1</w:t>
+            <w:r>
+              <w:t>0.0</w:t>
             </w:r>
           </w:p>
         </w:tc>
@@ -3472,12 +3121,8 @@
             <w:tcW w:w="998" w:type="dxa"/>
           </w:tcPr>
           <w:p>
-            <w:pPr>
-              <w:pStyle w:val="Compact"/>
-              <w:jc w:val="right"/>
-            </w:pPr>
-            <w:r>
-              <w:t>100%</w:t>
+            <w:r>
+              <w:t>0.0%</w:t>
             </w:r>
           </w:p>
         </w:tc>
@@ -3486,11 +3131,8 @@
             <w:tcW w:w="570" w:type="dxa"/>
           </w:tcPr>
           <w:p>
-            <w:pPr>
-              <w:pStyle w:val="Compact"/>
-            </w:pPr>
-            <w:r>
-              <w:t>High</w:t>
+            <w:r>
+              <w:t>Critical</w:t>
             </w:r>
           </w:p>
         </w:tc>
@@ -3501,9 +3143,6 @@
             <w:tcW w:w="1355" w:type="dxa"/>
           </w:tcPr>
           <w:p>
-            <w:pPr>
-              <w:pStyle w:val="Compact"/>
-            </w:pPr>
             <w:r>
               <w:t>Social Media (5003)</w:t>
             </w:r>
@@ -3514,11 +3153,8 @@
             <w:tcW w:w="2782" w:type="dxa"/>
           </w:tcPr>
           <w:p>
-            <w:pPr>
-              <w:pStyle w:val="Compact"/>
-            </w:pPr>
-            <w:r>
-              <w:t>Weak Reset Token</w:t>
+            <w:r>
+              <w:t>Path Traversal</w:t>
             </w:r>
           </w:p>
         </w:tc>
@@ -3527,10 +3163,6 @@
             <w:tcW w:w="998" w:type="dxa"/>
           </w:tcPr>
           <w:p>
-            <w:pPr>
-              <w:pStyle w:val="Compact"/>
-              <w:jc w:val="right"/>
-            </w:pPr>
             <w:r>
               <w:t>1</w:t>
             </w:r>
@@ -3541,12 +3173,8 @@
             <w:tcW w:w="1212" w:type="dxa"/>
           </w:tcPr>
           <w:p>
-            <w:pPr>
-              <w:pStyle w:val="Compact"/>
-              <w:jc w:val="right"/>
-            </w:pPr>
-            <w:r>
-              <w:t>1</w:t>
+            <w:r>
+              <w:t>0.0</w:t>
             </w:r>
           </w:p>
         </w:tc>
@@ -3555,12 +3183,8 @@
             <w:tcW w:w="998" w:type="dxa"/>
           </w:tcPr>
           <w:p>
-            <w:pPr>
-              <w:pStyle w:val="Compact"/>
-              <w:jc w:val="right"/>
-            </w:pPr>
-            <w:r>
-              <w:t>100%</w:t>
+            <w:r>
+              <w:t>0.0%</w:t>
             </w:r>
           </w:p>
         </w:tc>
@@ -3569,9 +3193,6 @@
             <w:tcW w:w="570" w:type="dxa"/>
           </w:tcPr>
           <w:p>
-            <w:pPr>
-              <w:pStyle w:val="Compact"/>
-            </w:pPr>
             <w:r>
               <w:t>High</w:t>
             </w:r>
@@ -3584,11 +3205,8 @@
             <w:tcW w:w="1355" w:type="dxa"/>
           </w:tcPr>
           <w:p>
-            <w:pPr>
-              <w:pStyle w:val="Compact"/>
-            </w:pPr>
-            <w:r>
-              <w:t>Banking (5004)</w:t>
+            <w:r>
+              <w:t>Social Media (5003)</w:t>
             </w:r>
           </w:p>
         </w:tc>
@@ -3597,11 +3215,8 @@
             <w:tcW w:w="2782" w:type="dxa"/>
           </w:tcPr>
           <w:p>
-            <w:pPr>
-              <w:pStyle w:val="Compact"/>
-            </w:pPr>
-            <w:r>
-              <w:t>Cross-Site Scripting (XSS)</w:t>
+            <w:r>
+              <w:t>Cross-Site Request Forgery (CSRF)</w:t>
             </w:r>
           </w:p>
         </w:tc>
@@ -3610,10 +3225,6 @@
             <w:tcW w:w="998" w:type="dxa"/>
           </w:tcPr>
           <w:p>
-            <w:pPr>
-              <w:pStyle w:val="Compact"/>
-              <w:jc w:val="right"/>
-            </w:pPr>
             <w:r>
               <w:t>1</w:t>
             </w:r>
@@ -3624,12 +3235,8 @@
             <w:tcW w:w="1212" w:type="dxa"/>
           </w:tcPr>
           <w:p>
-            <w:pPr>
-              <w:pStyle w:val="Compact"/>
-              <w:jc w:val="right"/>
-            </w:pPr>
-            <w:r>
-              <w:t>1</w:t>
+            <w:r>
+              <w:t>1.0</w:t>
             </w:r>
           </w:p>
         </w:tc>
@@ -3638,12 +3245,8 @@
             <w:tcW w:w="998" w:type="dxa"/>
           </w:tcPr>
           <w:p>
-            <w:pPr>
-              <w:pStyle w:val="Compact"/>
-              <w:jc w:val="right"/>
-            </w:pPr>
-            <w:r>
-              <w:t>100%</w:t>
+            <w:r>
+              <w:t>100.0%</w:t>
             </w:r>
           </w:p>
         </w:tc>
@@ -3652,11 +3255,8 @@
             <w:tcW w:w="570" w:type="dxa"/>
           </w:tcPr>
           <w:p>
-            <w:pPr>
-              <w:pStyle w:val="Compact"/>
-            </w:pPr>
-            <w:r>
-              <w:t>High</w:t>
+            <w:r>
+              <w:t>Medium</w:t>
             </w:r>
           </w:p>
         </w:tc>
@@ -3667,11 +3267,8 @@
             <w:tcW w:w="1355" w:type="dxa"/>
           </w:tcPr>
           <w:p>
-            <w:pPr>
-              <w:pStyle w:val="Compact"/>
-            </w:pPr>
-            <w:r>
-              <w:t>Banking (5004)</w:t>
+            <w:r>
+              <w:t>Social Media (5003)</w:t>
             </w:r>
           </w:p>
         </w:tc>
@@ -3680,11 +3277,8 @@
             <w:tcW w:w="2782" w:type="dxa"/>
           </w:tcPr>
           <w:p>
-            <w:pPr>
-              <w:pStyle w:val="Compact"/>
-            </w:pPr>
-            <w:r>
-              <w:t>Insecure Direct Object Reference (IDOR)</w:t>
+            <w:r>
+              <w:t>SQL Injection</w:t>
             </w:r>
           </w:p>
         </w:tc>
@@ -3693,10 +3287,6 @@
             <w:tcW w:w="998" w:type="dxa"/>
           </w:tcPr>
           <w:p>
-            <w:pPr>
-              <w:pStyle w:val="Compact"/>
-              <w:jc w:val="right"/>
-            </w:pPr>
             <w:r>
               <w:t>2</w:t>
             </w:r>
@@ -3707,12 +3297,8 @@
             <w:tcW w:w="1212" w:type="dxa"/>
           </w:tcPr>
           <w:p>
-            <w:pPr>
-              <w:pStyle w:val="Compact"/>
-              <w:jc w:val="right"/>
-            </w:pPr>
-            <w:r>
-              <w:t>0</w:t>
+            <w:r>
+              <w:t>0.8</w:t>
             </w:r>
           </w:p>
         </w:tc>
@@ -3721,12 +3307,8 @@
             <w:tcW w:w="998" w:type="dxa"/>
           </w:tcPr>
           <w:p>
-            <w:pPr>
-              <w:pStyle w:val="Compact"/>
-              <w:jc w:val="right"/>
-            </w:pPr>
-            <w:r>
-              <w:t>0%</w:t>
+            <w:r>
+              <w:t>40.0%</w:t>
             </w:r>
           </w:p>
         </w:tc>
@@ -3735,11 +3317,8 @@
             <w:tcW w:w="570" w:type="dxa"/>
           </w:tcPr>
           <w:p>
-            <w:pPr>
-              <w:pStyle w:val="Compact"/>
-            </w:pPr>
-            <w:r>
-              <w:t>Medium</w:t>
+            <w:r>
+              <w:t>Critical</w:t>
             </w:r>
           </w:p>
         </w:tc>
@@ -3750,11 +3329,8 @@
             <w:tcW w:w="1355" w:type="dxa"/>
           </w:tcPr>
           <w:p>
-            <w:pPr>
-              <w:pStyle w:val="Compact"/>
-            </w:pPr>
-            <w:r>
-              <w:t>Banking (5004)</w:t>
+            <w:r>
+              <w:t>Social Media (5003)</w:t>
             </w:r>
           </w:p>
         </w:tc>
@@ -3763,11 +3339,8 @@
             <w:tcW w:w="2782" w:type="dxa"/>
           </w:tcPr>
           <w:p>
-            <w:pPr>
-              <w:pStyle w:val="Compact"/>
-            </w:pPr>
-            <w:r>
-              <w:t>Cross-Site Request Forgery (CSRF)</w:t>
+            <w:r>
+              <w:t>JWT Bypass</w:t>
             </w:r>
           </w:p>
         </w:tc>
@@ -3776,10 +3349,6 @@
             <w:tcW w:w="998" w:type="dxa"/>
           </w:tcPr>
           <w:p>
-            <w:pPr>
-              <w:pStyle w:val="Compact"/>
-              <w:jc w:val="right"/>
-            </w:pPr>
             <w:r>
               <w:t>1</w:t>
             </w:r>
@@ -3790,12 +3359,8 @@
             <w:tcW w:w="1212" w:type="dxa"/>
           </w:tcPr>
           <w:p>
-            <w:pPr>
-              <w:pStyle w:val="Compact"/>
-              <w:jc w:val="right"/>
-            </w:pPr>
-            <w:r>
-              <w:t>1</w:t>
+            <w:r>
+              <w:t>0.0</w:t>
             </w:r>
           </w:p>
         </w:tc>
@@ -3804,12 +3369,8 @@
             <w:tcW w:w="998" w:type="dxa"/>
           </w:tcPr>
           <w:p>
-            <w:pPr>
-              <w:pStyle w:val="Compact"/>
-              <w:jc w:val="right"/>
-            </w:pPr>
-            <w:r>
-              <w:t>100%</w:t>
+            <w:r>
+              <w:t>0.0%</w:t>
             </w:r>
           </w:p>
         </w:tc>
@@ -3818,11 +3379,8 @@
             <w:tcW w:w="570" w:type="dxa"/>
           </w:tcPr>
           <w:p>
-            <w:pPr>
-              <w:pStyle w:val="Compact"/>
-            </w:pPr>
-            <w:r>
-              <w:t>Medium</w:t>
+            <w:r>
+              <w:t>High</w:t>
             </w:r>
           </w:p>
         </w:tc>
@@ -3833,11 +3391,8 @@
             <w:tcW w:w="1355" w:type="dxa"/>
           </w:tcPr>
           <w:p>
-            <w:pPr>
-              <w:pStyle w:val="Compact"/>
-            </w:pPr>
-            <w:r>
-              <w:t>Blog (5005)</w:t>
+            <w:r>
+              <w:t>Banking (5004)</w:t>
             </w:r>
           </w:p>
         </w:tc>
@@ -3846,11 +3401,8 @@
             <w:tcW w:w="2782" w:type="dxa"/>
           </w:tcPr>
           <w:p>
-            <w:pPr>
-              <w:pStyle w:val="Compact"/>
-            </w:pPr>
-            <w:r>
-              <w:t>Cross-Site Scripting (XSS)</w:t>
+            <w:r>
+              <w:t>Insecure Direct Object Reference (IDOR)</w:t>
             </w:r>
           </w:p>
         </w:tc>
@@ -3859,12 +3411,8 @@
             <w:tcW w:w="998" w:type="dxa"/>
           </w:tcPr>
           <w:p>
-            <w:pPr>
-              <w:pStyle w:val="Compact"/>
-              <w:jc w:val="right"/>
-            </w:pPr>
-            <w:r>
-              <w:t>4</w:t>
+            <w:r>
+              <w:t>2</w:t>
             </w:r>
           </w:p>
         </w:tc>
@@ -3873,12 +3421,8 @@
             <w:tcW w:w="1212" w:type="dxa"/>
           </w:tcPr>
           <w:p>
-            <w:pPr>
-              <w:pStyle w:val="Compact"/>
-              <w:jc w:val="right"/>
-            </w:pPr>
-            <w:r>
-              <w:t>1</w:t>
+            <w:r>
+              <w:t>0.0</w:t>
             </w:r>
           </w:p>
         </w:tc>
@@ -3887,12 +3431,8 @@
             <w:tcW w:w="998" w:type="dxa"/>
           </w:tcPr>
           <w:p>
-            <w:pPr>
-              <w:pStyle w:val="Compact"/>
-              <w:jc w:val="right"/>
-            </w:pPr>
-            <w:r>
-              <w:t>25%</w:t>
+            <w:r>
+              <w:t>0.0%</w:t>
             </w:r>
           </w:p>
         </w:tc>
@@ -3901,11 +3441,8 @@
             <w:tcW w:w="570" w:type="dxa"/>
           </w:tcPr>
           <w:p>
-            <w:pPr>
-              <w:pStyle w:val="Compact"/>
-            </w:pPr>
-            <w:r>
-              <w:t>High</w:t>
+            <w:r>
+              <w:t>Medium</w:t>
             </w:r>
           </w:p>
         </w:tc>
@@ -3916,11 +3453,8 @@
             <w:tcW w:w="1355" w:type="dxa"/>
           </w:tcPr>
           <w:p>
-            <w:pPr>
-              <w:pStyle w:val="Compact"/>
-            </w:pPr>
-            <w:r>
-              <w:t>Blog (5005)</w:t>
+            <w:r>
+              <w:t>Banking (5004)</w:t>
             </w:r>
           </w:p>
         </w:tc>
@@ -3929,11 +3463,8 @@
             <w:tcW w:w="2782" w:type="dxa"/>
           </w:tcPr>
           <w:p>
-            <w:pPr>
-              <w:pStyle w:val="Compact"/>
-            </w:pPr>
-            <w:r>
-              <w:t>Server-Side Request Forgery (SSRF)</w:t>
+            <w:r>
+              <w:t>Cross-Site Request Forgery (CSRF)</w:t>
             </w:r>
           </w:p>
         </w:tc>
@@ -3942,10 +3473,6 @@
             <w:tcW w:w="998" w:type="dxa"/>
           </w:tcPr>
           <w:p>
-            <w:pPr>
-              <w:pStyle w:val="Compact"/>
-              <w:jc w:val="right"/>
-            </w:pPr>
             <w:r>
               <w:t>1</w:t>
             </w:r>
@@ -3956,12 +3483,8 @@
             <w:tcW w:w="1212" w:type="dxa"/>
           </w:tcPr>
           <w:p>
-            <w:pPr>
-              <w:pStyle w:val="Compact"/>
-              <w:jc w:val="right"/>
-            </w:pPr>
-            <w:r>
-              <w:t>1</w:t>
+            <w:r>
+              <w:t>0.8</w:t>
             </w:r>
           </w:p>
         </w:tc>
@@ -3970,12 +3493,8 @@
             <w:tcW w:w="998" w:type="dxa"/>
           </w:tcPr>
           <w:p>
-            <w:pPr>
-              <w:pStyle w:val="Compact"/>
-              <w:jc w:val="right"/>
-            </w:pPr>
-            <w:r>
-              <w:t>100%</w:t>
+            <w:r>
+              <w:t>80.0%</w:t>
             </w:r>
           </w:p>
         </w:tc>
@@ -3984,11 +3503,8 @@
             <w:tcW w:w="570" w:type="dxa"/>
           </w:tcPr>
           <w:p>
-            <w:pPr>
-              <w:pStyle w:val="Compact"/>
-            </w:pPr>
-            <w:r>
-              <w:t>High</w:t>
+            <w:r>
+              <w:t>Medium</w:t>
             </w:r>
           </w:p>
         </w:tc>
@@ -3999,11 +3515,8 @@
             <w:tcW w:w="1355" w:type="dxa"/>
           </w:tcPr>
           <w:p>
-            <w:pPr>
-              <w:pStyle w:val="Compact"/>
-            </w:pPr>
-            <w:r>
-              <w:t>File Share (5006)</w:t>
+            <w:r>
+              <w:t>Banking (5004)</w:t>
             </w:r>
           </w:p>
         </w:tc>
@@ -4012,9 +3525,6 @@
             <w:tcW w:w="2782" w:type="dxa"/>
           </w:tcPr>
           <w:p>
-            <w:pPr>
-              <w:pStyle w:val="Compact"/>
-            </w:pPr>
             <w:r>
               <w:t>Cross-Site Scripting (XSS)</w:t>
             </w:r>
@@ -4025,10 +3535,6 @@
             <w:tcW w:w="998" w:type="dxa"/>
           </w:tcPr>
           <w:p>
-            <w:pPr>
-              <w:pStyle w:val="Compact"/>
-              <w:jc w:val="right"/>
-            </w:pPr>
             <w:r>
               <w:t>1</w:t>
             </w:r>
@@ -4039,12 +3545,8 @@
             <w:tcW w:w="1212" w:type="dxa"/>
           </w:tcPr>
           <w:p>
-            <w:pPr>
-              <w:pStyle w:val="Compact"/>
-              <w:jc w:val="right"/>
-            </w:pPr>
-            <w:r>
-              <w:t>1</w:t>
+            <w:r>
+              <w:t>0.8</w:t>
             </w:r>
           </w:p>
         </w:tc>
@@ -4053,12 +3555,8 @@
             <w:tcW w:w="998" w:type="dxa"/>
           </w:tcPr>
           <w:p>
-            <w:pPr>
-              <w:pStyle w:val="Compact"/>
-              <w:jc w:val="right"/>
-            </w:pPr>
-            <w:r>
-              <w:t>100%</w:t>
+            <w:r>
+              <w:t>80.0%</w:t>
             </w:r>
           </w:p>
         </w:tc>
@@ -4067,9 +3565,6 @@
             <w:tcW w:w="570" w:type="dxa"/>
           </w:tcPr>
           <w:p>
-            <w:pPr>
-              <w:pStyle w:val="Compact"/>
-            </w:pPr>
             <w:r>
               <w:t>High</w:t>
             </w:r>
@@ -4082,9 +3577,192 @@
             <w:tcW w:w="1355" w:type="dxa"/>
           </w:tcPr>
           <w:p>
-            <w:pPr>
-              <w:pStyle w:val="Compact"/>
-            </w:pPr>
+            <w:r>
+              <w:t>Blog (5005)</w:t>
+            </w:r>
+          </w:p>
+        </w:tc>
+        <w:tc>
+          <w:tcPr>
+            <w:tcW w:w="2782" w:type="dxa"/>
+          </w:tcPr>
+          <w:p>
+            <w:r>
+              <w:t>Cross-Site Scripting (XSS)</w:t>
+            </w:r>
+          </w:p>
+        </w:tc>
+        <w:tc>
+          <w:tcPr>
+            <w:tcW w:w="998" w:type="dxa"/>
+          </w:tcPr>
+          <w:p>
+            <w:r>
+              <w:t>4</w:t>
+            </w:r>
+          </w:p>
+        </w:tc>
+        <w:tc>
+          <w:tcPr>
+            <w:tcW w:w="1212" w:type="dxa"/>
+          </w:tcPr>
+          <w:p>
+            <w:r>
+              <w:t>0.4</w:t>
+            </w:r>
+          </w:p>
+        </w:tc>
+        <w:tc>
+          <w:tcPr>
+            <w:tcW w:w="998" w:type="dxa"/>
+          </w:tcPr>
+          <w:p>
+            <w:r>
+              <w:t>10.0%</w:t>
+            </w:r>
+          </w:p>
+        </w:tc>
+        <w:tc>
+          <w:tcPr>
+            <w:tcW w:w="570" w:type="dxa"/>
+          </w:tcPr>
+          <w:p>
+            <w:r>
+              <w:t>High</w:t>
+            </w:r>
+          </w:p>
+        </w:tc>
+      </w:tr>
+      <w:tr>
+        <w:tc>
+          <w:tcPr>
+            <w:tcW w:type="dxa" w:w="1640"/>
+          </w:tcPr>
+          <w:p>
+            <w:r>
+              <w:t>Blog (5005)</w:t>
+            </w:r>
+          </w:p>
+        </w:tc>
+        <w:tc>
+          <w:tcPr>
+            <w:tcW w:type="dxa" w:w="3366"/>
+          </w:tcPr>
+          <w:p>
+            <w:r>
+              <w:t>JWT Bypass</w:t>
+            </w:r>
+          </w:p>
+        </w:tc>
+        <w:tc>
+          <w:tcPr>
+            <w:tcW w:type="dxa" w:w="1207"/>
+          </w:tcPr>
+          <w:p>
+            <w:r>
+              <w:t>1</w:t>
+            </w:r>
+          </w:p>
+        </w:tc>
+        <w:tc>
+          <w:tcPr>
+            <w:tcW w:type="dxa" w:w="1466"/>
+          </w:tcPr>
+          <w:p>
+            <w:r>
+              <w:t>0.0</w:t>
+            </w:r>
+          </w:p>
+        </w:tc>
+        <w:tc>
+          <w:tcPr>
+            <w:tcW w:type="dxa" w:w="1207"/>
+          </w:tcPr>
+          <w:p>
+            <w:r>
+              <w:t>0.0%</w:t>
+            </w:r>
+          </w:p>
+        </w:tc>
+        <w:tc>
+          <w:tcPr>
+            <w:tcW w:type="dxa" w:w="690"/>
+          </w:tcPr>
+          <w:p>
+            <w:r>
+              <w:t>High</w:t>
+            </w:r>
+          </w:p>
+        </w:tc>
+      </w:tr>
+      <w:tr>
+        <w:tc>
+          <w:tcPr>
+            <w:tcW w:type="dxa" w:w="1640"/>
+          </w:tcPr>
+          <w:p>
+            <w:r>
+              <w:t>Blog (5005)</w:t>
+            </w:r>
+          </w:p>
+        </w:tc>
+        <w:tc>
+          <w:tcPr>
+            <w:tcW w:type="dxa" w:w="3366"/>
+          </w:tcPr>
+          <w:p>
+            <w:r>
+              <w:t>Server-Side Request Forgery (SSRF)</w:t>
+            </w:r>
+          </w:p>
+        </w:tc>
+        <w:tc>
+          <w:tcPr>
+            <w:tcW w:type="dxa" w:w="1207"/>
+          </w:tcPr>
+          <w:p>
+            <w:r>
+              <w:t>1</w:t>
+            </w:r>
+          </w:p>
+        </w:tc>
+        <w:tc>
+          <w:tcPr>
+            <w:tcW w:type="dxa" w:w="1466"/>
+          </w:tcPr>
+          <w:p>
+            <w:r>
+              <w:t>0.0</w:t>
+            </w:r>
+          </w:p>
+        </w:tc>
+        <w:tc>
+          <w:tcPr>
+            <w:tcW w:type="dxa" w:w="1207"/>
+          </w:tcPr>
+          <w:p>
+            <w:r>
+              <w:t>0.0%</w:t>
+            </w:r>
+          </w:p>
+        </w:tc>
+        <w:tc>
+          <w:tcPr>
+            <w:tcW w:type="dxa" w:w="690"/>
+          </w:tcPr>
+          <w:p>
+            <w:r>
+              <w:t>High</w:t>
+            </w:r>
+          </w:p>
+        </w:tc>
+      </w:tr>
+      <w:tr>
+        <w:tc>
+          <w:tcPr>
+            <w:tcW w:type="dxa" w:w="1640"/>
+          </w:tcPr>
+          <w:p>
             <w:r>
               <w:t>File Share (5006)</w:t>
             </w:r>
@@ -4092,12 +3770,257 @@
         </w:tc>
         <w:tc>
           <w:tcPr>
-            <w:tcW w:w="2782" w:type="dxa"/>
-          </w:tcPr>
-          <w:p>
-            <w:pPr>
-              <w:pStyle w:val="Compact"/>
-            </w:pPr>
+            <w:tcW w:type="dxa" w:w="3366"/>
+          </w:tcPr>
+          <w:p>
+            <w:r>
+              <w:t>File Upload</w:t>
+            </w:r>
+          </w:p>
+        </w:tc>
+        <w:tc>
+          <w:tcPr>
+            <w:tcW w:type="dxa" w:w="1207"/>
+          </w:tcPr>
+          <w:p>
+            <w:r>
+              <w:t>1</w:t>
+            </w:r>
+          </w:p>
+        </w:tc>
+        <w:tc>
+          <w:tcPr>
+            <w:tcW w:type="dxa" w:w="1466"/>
+          </w:tcPr>
+          <w:p>
+            <w:r>
+              <w:t>0.0</w:t>
+            </w:r>
+          </w:p>
+        </w:tc>
+        <w:tc>
+          <w:tcPr>
+            <w:tcW w:type="dxa" w:w="1207"/>
+          </w:tcPr>
+          <w:p>
+            <w:r>
+              <w:t>0.0%</w:t>
+            </w:r>
+          </w:p>
+        </w:tc>
+        <w:tc>
+          <w:tcPr>
+            <w:tcW w:type="dxa" w:w="690"/>
+          </w:tcPr>
+          <w:p>
+            <w:r>
+              <w:t>Critical</w:t>
+            </w:r>
+          </w:p>
+        </w:tc>
+      </w:tr>
+      <w:tr>
+        <w:tc>
+          <w:tcPr>
+            <w:tcW w:type="dxa" w:w="1640"/>
+          </w:tcPr>
+          <w:p>
+            <w:r>
+              <w:t>File Share (5006)</w:t>
+            </w:r>
+          </w:p>
+        </w:tc>
+        <w:tc>
+          <w:tcPr>
+            <w:tcW w:type="dxa" w:w="3366"/>
+          </w:tcPr>
+          <w:p>
+            <w:r>
+              <w:t>Cross-Site Scripting (XSS)</w:t>
+            </w:r>
+          </w:p>
+        </w:tc>
+        <w:tc>
+          <w:tcPr>
+            <w:tcW w:type="dxa" w:w="1207"/>
+          </w:tcPr>
+          <w:p>
+            <w:r>
+              <w:t>1</w:t>
+            </w:r>
+          </w:p>
+        </w:tc>
+        <w:tc>
+          <w:tcPr>
+            <w:tcW w:type="dxa" w:w="1466"/>
+          </w:tcPr>
+          <w:p>
+            <w:r>
+              <w:t>0.2</w:t>
+            </w:r>
+          </w:p>
+        </w:tc>
+        <w:tc>
+          <w:tcPr>
+            <w:tcW w:type="dxa" w:w="1207"/>
+          </w:tcPr>
+          <w:p>
+            <w:r>
+              <w:t>20.0%</w:t>
+            </w:r>
+          </w:p>
+        </w:tc>
+        <w:tc>
+          <w:tcPr>
+            <w:tcW w:type="dxa" w:w="690"/>
+          </w:tcPr>
+          <w:p>
+            <w:r>
+              <w:t>High</w:t>
+            </w:r>
+          </w:p>
+        </w:tc>
+      </w:tr>
+      <w:tr>
+        <w:tc>
+          <w:tcPr>
+            <w:tcW w:type="dxa" w:w="1640"/>
+          </w:tcPr>
+          <w:p>
+            <w:r>
+              <w:t>File Share (5006)</w:t>
+            </w:r>
+          </w:p>
+        </w:tc>
+        <w:tc>
+          <w:tcPr>
+            <w:tcW w:type="dxa" w:w="3366"/>
+          </w:tcPr>
+          <w:p>
+            <w:r>
+              <w:t>Insecure Direct Object Reference (IDOR)</w:t>
+            </w:r>
+          </w:p>
+        </w:tc>
+        <w:tc>
+          <w:tcPr>
+            <w:tcW w:type="dxa" w:w="1207"/>
+          </w:tcPr>
+          <w:p>
+            <w:r>
+              <w:t>2</w:t>
+            </w:r>
+          </w:p>
+        </w:tc>
+        <w:tc>
+          <w:tcPr>
+            <w:tcW w:type="dxa" w:w="1466"/>
+          </w:tcPr>
+          <w:p>
+            <w:r>
+              <w:t>0.4</w:t>
+            </w:r>
+          </w:p>
+        </w:tc>
+        <w:tc>
+          <w:tcPr>
+            <w:tcW w:type="dxa" w:w="1207"/>
+          </w:tcPr>
+          <w:p>
+            <w:r>
+              <w:t>20.0%</w:t>
+            </w:r>
+          </w:p>
+        </w:tc>
+        <w:tc>
+          <w:tcPr>
+            <w:tcW w:type="dxa" w:w="690"/>
+          </w:tcPr>
+          <w:p>
+            <w:r>
+              <w:t>Medium</w:t>
+            </w:r>
+          </w:p>
+        </w:tc>
+      </w:tr>
+      <w:tr>
+        <w:tc>
+          <w:tcPr>
+            <w:tcW w:type="dxa" w:w="1640"/>
+          </w:tcPr>
+          <w:p>
+            <w:r>
+              <w:t>File Share (5006)</w:t>
+            </w:r>
+          </w:p>
+        </w:tc>
+        <w:tc>
+          <w:tcPr>
+            <w:tcW w:type="dxa" w:w="3366"/>
+          </w:tcPr>
+          <w:p>
+            <w:r>
+              <w:t>Path Traversal</w:t>
+            </w:r>
+          </w:p>
+        </w:tc>
+        <w:tc>
+          <w:tcPr>
+            <w:tcW w:type="dxa" w:w="1207"/>
+          </w:tcPr>
+          <w:p>
+            <w:r>
+              <w:t>1</w:t>
+            </w:r>
+          </w:p>
+        </w:tc>
+        <w:tc>
+          <w:tcPr>
+            <w:tcW w:type="dxa" w:w="1466"/>
+          </w:tcPr>
+          <w:p>
+            <w:r>
+              <w:t>0.2</w:t>
+            </w:r>
+          </w:p>
+        </w:tc>
+        <w:tc>
+          <w:tcPr>
+            <w:tcW w:type="dxa" w:w="1207"/>
+          </w:tcPr>
+          <w:p>
+            <w:r>
+              <w:t>20.0%</w:t>
+            </w:r>
+          </w:p>
+        </w:tc>
+        <w:tc>
+          <w:tcPr>
+            <w:tcW w:type="dxa" w:w="690"/>
+          </w:tcPr>
+          <w:p>
+            <w:r>
+              <w:t>High</w:t>
+            </w:r>
+          </w:p>
+        </w:tc>
+      </w:tr>
+      <w:tr>
+        <w:tc>
+          <w:tcPr>
+            <w:tcW w:type="dxa" w:w="1640"/>
+          </w:tcPr>
+          <w:p>
+            <w:r>
+              <w:t>File Share (5006)</w:t>
+            </w:r>
+          </w:p>
+        </w:tc>
+        <w:tc>
+          <w:tcPr>
+            <w:tcW w:type="dxa" w:w="3366"/>
+          </w:tcPr>
+          <w:p>
             <w:r>
               <w:t>Command Injection</w:t>
             </w:r>
@@ -4105,13 +4028,9 @@
         </w:tc>
         <w:tc>
           <w:tcPr>
-            <w:tcW w:w="998" w:type="dxa"/>
-          </w:tcPr>
-          <w:p>
-            <w:pPr>
-              <w:pStyle w:val="Compact"/>
-              <w:jc w:val="right"/>
-            </w:pPr>
+            <w:tcW w:type="dxa" w:w="1207"/>
+          </w:tcPr>
+          <w:p>
             <w:r>
               <w:t>1</w:t>
             </w:r>
@@ -4119,40 +4038,29 @@
         </w:tc>
         <w:tc>
           <w:tcPr>
-            <w:tcW w:w="1212" w:type="dxa"/>
-          </w:tcPr>
-          <w:p>
-            <w:pPr>
-              <w:pStyle w:val="Compact"/>
-              <w:jc w:val="right"/>
-            </w:pPr>
-            <w:r>
-              <w:t>1</w:t>
-            </w:r>
-          </w:p>
-        </w:tc>
-        <w:tc>
-          <w:tcPr>
-            <w:tcW w:w="998" w:type="dxa"/>
-          </w:tcPr>
-          <w:p>
-            <w:pPr>
-              <w:pStyle w:val="Compact"/>
-              <w:jc w:val="right"/>
-            </w:pPr>
-            <w:r>
-              <w:t>100%</w:t>
-            </w:r>
-          </w:p>
-        </w:tc>
-        <w:tc>
-          <w:tcPr>
-            <w:tcW w:w="570" w:type="dxa"/>
-          </w:tcPr>
-          <w:p>
-            <w:pPr>
-              <w:pStyle w:val="Compact"/>
-            </w:pPr>
+            <w:tcW w:type="dxa" w:w="1466"/>
+          </w:tcPr>
+          <w:p>
+            <w:r>
+              <w:t>0.0</w:t>
+            </w:r>
+          </w:p>
+        </w:tc>
+        <w:tc>
+          <w:tcPr>
+            <w:tcW w:type="dxa" w:w="1207"/>
+          </w:tcPr>
+          <w:p>
+            <w:r>
+              <w:t>0.0%</w:t>
+            </w:r>
+          </w:p>
+        </w:tc>
+        <w:tc>
+          <w:tcPr>
+            <w:tcW w:type="dxa" w:w="690"/>
+          </w:tcPr>
+          <w:p>
             <w:r>
               <w:t>Critical</w:t>
             </w:r>
@@ -4165,7 +4073,7 @@
         <w:pStyle w:val="BodyText"/>
       </w:pPr>
       <w:r>
-        <w:t>As shown, the RL agent has a surprisingly strong talent for uncovering standard injection flaws and state-based issues. It hit a 100% detection rate for Cross-Site Scripting (XSS) on the Banking and File Share platforms. It successfully found critical vulnerabilities like Command Injection, Server-Side Request Forgery (SSRF), and Broken Access Control without skipping a beat.</w:t>
+        <w:t>The repeated tests show that the model has low-to-moderate coverage overall. It works best on the E-Commerce website, and it also finds some vulnerabilities in Social Media and Banking, especially SQL Injection, XSS, CSRF, and some IDOR cases.</w:t>
       </w:r>
     </w:p>
     <w:p>
@@ -4173,7 +4081,7 @@
         <w:pStyle w:val="BodyText"/>
       </w:pPr>
       <w:r>
-        <w:t>That being said, the evaluation does shine a light on where the agent struggles. Complex logic vulnerabilities, such as Insecure Direct Object Reference (IDOR), were incredibly difficult for the agent to spot consistently. These flaws often require deep, contextual understanding of what user data belongs to whom across multiple sequential requests. Additionally, complex multi-step exploits like uploading a malicious file and then subsequently triggering it via path traversal proved difficult. This suggests that while RL is incredible at chaining payloads on a syntax level, giving it true abstract business-logic comprehension represents the next major hurdle for completely autonomous pentesting.</w:t>
+        <w:t>The weaker results on Blog and File Share show an important limitation. The scanner is better at direct input attacks than at deeper logic, authorization, and multi-step exploit problems. So, the low detection rate should not be seen as a failure of the benchmark. The benchmark is still useful because it contains known vulnerabilities and clearly shows where the current model is still weak.</w:t>
       </w:r>
     </w:p>
     <w:p>

</xml_diff>